<commit_message>
docs: report v2 — correct write-framework claim, add lazy-hit + NodeBlock slimming
- Remove the erroneous "write-framework ~90ms idle overhead" (§5.4): verified
  to be a cold-cache first-run artifact (warm baseline1 == baseline2 == 9.7ms).
- Add O(1) cache-hit (lazy eviction) results: SIFT 100K 512MB cache 53.3->9.76ms.
- Add NodeBlock slimming (4KB->2KB) results: index halved (SIFT 391->195MB,
  BigANN 3.9->2.0GB), recall unchanged; capped BigANN learned 81ms+OOM -> 9.15ms
  no-OOM.
- Clarify cache_size_mb=0 means unbounded cache, not no-cache.

Co-Authored-By: Claude Opus 4.7 <noreply@anthropic.com>
</commit_message>
<xml_diff>
--- a/docs/实验报告-IO优化-2026-05-28.docx
+++ b/docs/实验报告-IO优化-2026-05-28.docx
@@ -4,7 +4,7 @@
   <w:body>
     <w:p>
       <w:pPr>
-        <w:spacing w:after="120" w:before="1200"/>
+        <w:spacing w:after="120" w:before="1000"/>
         <w:jc w:val="center"/>
       </w:pPr>
       <w:r>
@@ -33,7 +33,7 @@
           <w:sz w:val="32"/>
           <w:szCs w:val="32"/>
         </w:rPr>
-        <w:t xml:space="preserve">磁盘 HNSW 的 I/O 优化：实验报告</w:t>
+        <w:t xml:space="preserve">磁盘 HNSW 的 I/O 优化：实验报告（v2）</w:t>
       </w:r>
     </w:p>
     <w:p>
@@ -154,7 +154,7 @@
           <w:sz w:val="21"/>
           <w:szCs w:val="21"/>
         </w:rPr>
-        <w:t xml:space="preserve">本报告记录了 amio 磁盘 HNSW 向量检索引擎一轮关键修复与性能优化，并在 Linux 实机上以 SIFT、GIST(960维) 与 BigANN 十亿级数据集的 1M 子集进行了系统评测。核心结论：</w:t>
+        <w:t xml:space="preserve">本报告记录 amio 磁盘 HNSW 向量检索引擎多轮修复与优化，并在 Linux 实机以 SIFT、GIST(960维)、BigANN 十亿级数据集的 1M 子集做系统评测。核心结论：</w:t>
       </w:r>
     </w:p>
     <w:p>
@@ -172,7 +172,7 @@
           <w:sz w:val="21"/>
           <w:szCs w:val="21"/>
         </w:rPr>
-        <w:t xml:space="preserve">修复了一个导致召回崩塌的 RobustPrune 构图 bug：SIFT 100K 召回从 0.121 恢复到 1.000，GIST 960维 从 0.0075 恢复到 0.999，BigANN 1M 达 0.991。</w:t>
+        <w:t xml:space="preserve">修复 RobustPrune 召回 bug：SIFT 100K 0.121→1.000，GIST 960维 0.0075→0.999，BigANN 1M 0.991。</w:t>
       </w:r>
     </w:p>
     <w:p>
@@ -190,7 +190,7 @@
           <w:sz w:val="21"/>
           <w:szCs w:val="21"/>
         </w:rPr>
-        <w:t xml:space="preserve">引入 AVX2/FMA SIMD 距离计算：GIST 960维 端到端提速 2.31×，SIFT 128维 1.43×，召回不变。</w:t>
+        <w:t xml:space="preserve">SIMD 距离(AVX2/FMA)：GIST 960维端到端 2.31×，SIFT 1.43×，召回不变。</w:t>
       </w:r>
     </w:p>
     <w:p>
@@ -208,7 +208,7 @@
           <w:sz w:val="21"/>
           <w:szCs w:val="21"/>
         </w:rPr>
-        <w:t xml:space="preserve">将图感知缓存的淘汰从 O(n) 全表扫描改为 O(log n) 有序索引：内存受限场景下单查询延迟从 2173.9ms 降到 17.2ms（约 126×）。</w:t>
+        <w:t xml:space="preserve">缓存淘汰 O(n)→O(log n)：32MB 缓存下 2174ms→17ms(126×)。</w:t>
       </w:r>
     </w:p>
     <w:p>
@@ -226,44 +226,7 @@
           <w:sz w:val="21"/>
           <w:szCs w:val="21"/>
         </w:rPr>
-        <w:t xml:space="preserve">在 BigANN 1M（128维，索引 3.9GB）上对比 Linux 原生 I/O 与本引擎优化：满内存时本引擎将磁盘块读数砍半；内存受限（数据 &gt; 内存）时，Linux 原生模式被 OOM 杀死，而本引擎的学习策略凭准入控制存活并稳定服务（81ms / recall 0.994）。</w:t>
-      </w:r>
-    </w:p>
-    <w:p>
-      <w:pPr>
-        <w:pStyle w:val="Heading1"/>
-      </w:pPr>
-      <w:r>
-        <w:rPr>
-          <w:rFonts w:ascii="Microsoft YaHei" w:cs="Microsoft YaHei" w:eastAsia="Microsoft YaHei" w:hAnsi="Microsoft YaHei"/>
-        </w:rPr>
-        <w:t xml:space="preserve">2  系统与实验方法</w:t>
-      </w:r>
-    </w:p>
-    <w:p>
-      <w:pPr>
-        <w:spacing w:after="120" w:line="276"/>
-      </w:pPr>
-      <w:r>
-        <w:rPr>
-          <w:rFonts w:ascii="Microsoft YaHei" w:cs="Microsoft YaHei" w:eastAsia="Microsoft YaHei" w:hAnsi="Microsoft YaHei"/>
-          <w:sz w:val="21"/>
-          <w:szCs w:val="21"/>
-        </w:rPr>
-        <w:t xml:space="preserve">amio 是磁盘 HNSW 检索 + 图感知缓存（静态子图 pin + 动态 LRU）+ 拓扑预取 + 增量写链路的工程系统。评测工具 eval_disk 输出 recall@k、QPS、延迟分位、同步磁盘块读数、缓存命中、预取有效性等指标，并支持 builtin（C++ 内置默认策略）与 learned（离线学习的 JSON 策略）两种模式对照。</w:t>
-      </w:r>
-    </w:p>
-    <w:p>
-      <w:pPr>
-        <w:spacing w:after="120" w:line="276"/>
-      </w:pPr>
-      <w:r>
-        <w:rPr>
-          <w:rFonts w:ascii="Microsoft YaHei" w:cs="Microsoft YaHei" w:eastAsia="Microsoft YaHei" w:hAnsi="Microsoft YaHei"/>
-          <w:sz w:val="21"/>
-          <w:szCs w:val="21"/>
-        </w:rPr>
-        <w:t xml:space="preserve">两类对照模式：</w:t>
+        <w:t xml:space="preserve">缓存命中 O(log n)→O(1)(惰性驱逐)：512MB 缓存下 53.3→9.76ms(5.5×)，p99 298→32ms，治好了"缓存越大越慢"。</w:t>
       </w:r>
     </w:p>
     <w:p>
@@ -281,7 +244,7 @@
           <w:sz w:val="21"/>
           <w:szCs w:val="21"/>
         </w:rPr>
-        <w:t xml:space="preserve">Linux 原生 I/O：eval_disk 的 baseline1（关闭应用缓存/预取/静态 pin，依赖 OS 的 pread 与页缓存）与 baseline2（仅保留磁盘 HNSW 主检索路径）。</w:t>
+        <w:t xml:space="preserve">NodeBlock 瘦身 4KB→2KB：索引减半(SIFT 391→195MB、BigANN 3.9→2.0GB)，召回不变；受限内存下 BigANN learned 9.15ms 且不再 OOM(原 4KB 为 81ms 且多模式 OOM)。</w:t>
       </w:r>
     </w:p>
     <w:p>
@@ -299,7 +262,18 @@
           <w:sz w:val="21"/>
           <w:szCs w:val="21"/>
         </w:rPr>
-        <w:t xml:space="preserve">本引擎优化：full 模式 + builtin / learned 策略（启用图感知缓存、静态子图 pin、拓扑预取）。</w:t>
+        <w:t xml:space="preserve">诚实纠正：原 v1 报告"写链路框架 90ms 空转开销"经验证为冷缓存假象，实为无开销，已删除该结论。</w:t>
+      </w:r>
+    </w:p>
+    <w:p>
+      <w:pPr>
+        <w:pStyle w:val="Heading1"/>
+      </w:pPr>
+      <w:r>
+        <w:rPr>
+          <w:rFonts w:ascii="Microsoft YaHei" w:cs="Microsoft YaHei" w:eastAsia="Microsoft YaHei" w:hAnsi="Microsoft YaHei"/>
+        </w:rPr>
+        <w:t xml:space="preserve">2  系统与实验方法</w:t>
       </w:r>
     </w:p>
     <w:p>
@@ -312,7 +286,20 @@
           <w:sz w:val="21"/>
           <w:szCs w:val="21"/>
         </w:rPr>
-        <w:t xml:space="preserve">两种内存条件：满内存（数据全部驻留 OS 页缓存）与受限内存（cgroup v2 memory.max 限制，使索引大于可用内存，强制真实磁盘 I/O）。</w:t>
+        <w:t xml:space="preserve">amio = 磁盘 HNSW 检索 + 图感知缓存(静态 pin + 动态 LRU) + 拓扑预取 + LSM 式写链路。评测工具 eval_disk 输出 recall@k、QPS、延迟分位、同步磁盘块读数、缓存命中、预取有效性等，支持 builtin(内置默认)与 learned(离线 JSON 策略)两模式。</w:t>
+      </w:r>
+    </w:p>
+    <w:p>
+      <w:pPr>
+        <w:spacing w:after="120" w:line="276"/>
+      </w:pPr>
+      <w:r>
+        <w:rPr>
+          <w:rFonts w:ascii="Microsoft YaHei" w:cs="Microsoft YaHei" w:eastAsia="Microsoft YaHei" w:hAnsi="Microsoft YaHei"/>
+          <w:sz w:val="21"/>
+          <w:szCs w:val="21"/>
+        </w:rPr>
+        <w:t xml:space="preserve">对照：Linux 原生 I/O = baseline1(关缓存/预取/pin)、baseline2(仅磁盘 HNSW 主路径)；本引擎优化 = full + builtin/learned。两种内存条件：满内存(全驻留页缓存)与受限内存(cgroup v2 memory.max 限制，索引大于可用内存，强制真实磁盘 I/O)。</w:t>
       </w:r>
     </w:p>
     <w:p>
@@ -327,7 +314,7 @@
           <w:sz w:val="21"/>
           <w:szCs w:val="21"/>
         </w:rPr>
-        <w:t xml:space="preserve">重要前提：本评测机的 liburing 过旧，io_uring 被禁用（AMIO_ENABLE_URING=OFF），异步预取退化为 noop。因此本报告中预取的异步收益未被体现，本引擎的优势主要来自缓存命中、静态 pin 与准入策略。</w:t>
+        <w:t xml:space="preserve">重要前提：评测机 liburing 过旧，io_uring 禁用(noop)，异步预取收益未体现；本引擎优势来自缓存命中、静态 pin、准入策略。</w:t>
       </w:r>
     </w:p>
     <w:p>
@@ -338,7 +325,7 @@
         <w:rPr>
           <w:rFonts w:ascii="Microsoft YaHei" w:cs="Microsoft YaHei" w:eastAsia="Microsoft YaHei" w:hAnsi="Microsoft YaHei"/>
         </w:rPr>
-        <w:t xml:space="preserve">3  本轮关键修复与优化</w:t>
+        <w:t xml:space="preserve">3  关键修复与优化</w:t>
       </w:r>
     </w:p>
     <w:p>
@@ -349,7 +336,7 @@
         <w:rPr>
           <w:rFonts w:ascii="Microsoft YaHei" w:cs="Microsoft YaHei" w:eastAsia="Microsoft YaHei" w:hAnsi="Microsoft YaHei"/>
         </w:rPr>
-        <w:t xml:space="preserve">3.1  召回崩塌 bug 修复（RobustPrune 遮挡不等式）</w:t>
+        <w:t xml:space="preserve">3.1  召回崩塌修复(RobustPrune 遮挡不等式)</w:t>
       </w:r>
     </w:p>
     <w:p>
@@ -362,7 +349,7 @@
           <w:sz w:val="21"/>
           <w:szCs w:val="21"/>
         </w:rPr>
-        <w:t xml:space="preserve">HnswIndex::robust_prune 实现 DiskANN/Vamana 的多样性剪枝时，遮挡不等式写反（alpha 放在了错误的一侧：dist_cs ≤ alpha·dist_cp），导致几乎每个候选在选入第一个邻居后即被剪掉，每个节点最终只剩约 1 个邻居，图退化、召回崩塌。修正为正确的 alpha·d(已选,候选) ≤ d(中心,候选) 后召回恢复正常。</w:t>
+        <w:t xml:space="preserve">robust_prune 的 DiskANN 遮挡判据 alpha 放错边，致每节点被过度剪枝到约 1 个邻居、图退化、召回崩。修正为 alpha·d(已选,候选) ≤ d(中心,候选) 后恢复。</w:t>
       </w:r>
     </w:p>
     <w:p>
@@ -373,7 +360,7 @@
         <w:rPr>
           <w:rFonts w:ascii="Microsoft YaHei" w:cs="Microsoft YaHei" w:eastAsia="Microsoft YaHei" w:hAnsi="Microsoft YaHei"/>
         </w:rPr>
-        <w:t xml:space="preserve">3.2  评测口径修复（recompute-gt 跑 0 条 query）</w:t>
+        <w:t xml:space="preserve">3.2  SIMD 距离(AVX2+FMA，运行时派发)</w:t>
       </w:r>
     </w:p>
     <w:p>
@@ -386,7 +373,7 @@
           <w:sz w:val="21"/>
           <w:szCs w:val="21"/>
         </w:rPr>
-        <w:t xml:space="preserve">eval_disk 在 --recompute-gt 1 时用 gt_all.size() 计算查询数 nq，而重算 GT 时 GT 文件未加载、size 为 0，导致评测 0 条 query。修正后子集评测的召回数才可信。</w:t>
+        <w:t xml:space="preserve">新增 util/simd_distance.h，x86 用 __attribute__((target("avx2,fma"))) 局部启用、运行时派发，标量兜底；接入 HnswIndex / ExternalVectorStore / VectorStore 三处距离。</w:t>
       </w:r>
     </w:p>
     <w:p>
@@ -397,7 +384,7 @@
         <w:rPr>
           <w:rFonts w:ascii="Microsoft YaHei" w:cs="Microsoft YaHei" w:eastAsia="Microsoft YaHei" w:hAnsi="Microsoft YaHei"/>
         </w:rPr>
-        <w:t xml:space="preserve">3.3  建图加速（add_edge 未满直接追加）</w:t>
+        <w:t xml:space="preserve">3.3  建图加速(add_edge 未满直接追加)</w:t>
       </w:r>
     </w:p>
     <w:p>
@@ -410,7 +397,7 @@
           <w:sz w:val="21"/>
           <w:szCs w:val="21"/>
         </w:rPr>
-        <w:t xml:space="preserve">修复召回后图变稠密，原 add_edge 每加一条边都重跑 O(cap²) 的 RobustPrune，使 1M 建图不可用。改为邻居表未满时直接追加、仅在超过容量上限时才重剪枝（hnswlib/DiskANN 同款），大幅降低建图成本。</w:t>
+        <w:t xml:space="preserve">邻居表未满时直接追加，仅超容量才重跑 RobustPrune(hnswlib/DiskANN 同款)，避免每条边 O(cap²) 重剪枝，使 1M 建图可行。</w:t>
       </w:r>
     </w:p>
     <w:p>
@@ -421,7 +408,7 @@
         <w:rPr>
           <w:rFonts w:ascii="Microsoft YaHei" w:cs="Microsoft YaHei" w:eastAsia="Microsoft YaHei" w:hAnsi="Microsoft YaHei"/>
         </w:rPr>
-        <w:t xml:space="preserve">3.4  SIMD 距离（AVX2 + FMA，运行时派发）</w:t>
+        <w:t xml:space="preserve">3.4  缓存淘汰 O(n)→O(log n)</w:t>
       </w:r>
     </w:p>
     <w:p>
@@ -434,7 +421,7 @@
           <w:sz w:val="21"/>
           <w:szCs w:val="21"/>
         </w:rPr>
-        <w:t xml:space="preserve">新增 util/simd_distance.h，统一 L2 平方距离：x86 上以 __attribute__((target("avx2,fma"))) 局部启用 AVX2，通过 __builtin_cpu_supports 运行时派发，无 AVX2 时标量兜底；环境变量 AMIO_FORCE_SCALAR=1 可强制标量做 A/B。已接入 HnswIndex、ExternalVectorStore、VectorStore 三处距离计算。</w:t>
+        <w:t xml:space="preserve">ISVM 驱逐分 = tick_age/16 + C(与时间无关)，驱逐时 tick_ 对所有条目相同，故 argmax 等价 argmax(16·C − tick) 为稳定键；用有序集合 ev_index_ 取最大键，O(log n) 完成且保持 ISVM 排序。</w:t>
       </w:r>
     </w:p>
     <w:p>
@@ -445,7 +432,7 @@
         <w:rPr>
           <w:rFonts w:ascii="Microsoft YaHei" w:cs="Microsoft YaHei" w:eastAsia="Microsoft YaHei" w:hAnsi="Microsoft YaHei"/>
         </w:rPr>
-        <w:t xml:space="preserve">3.5  缓存淘汰 O(n) → O(log n)</w:t>
+        <w:t xml:space="preserve">3.5  缓存命中 O(log n)→O(1)(惰性驱逐)</w:t>
       </w:r>
     </w:p>
     <w:p>
@@ -458,7 +445,55 @@
           <w:sz w:val="21"/>
           <w:szCs w:val="21"/>
         </w:rPr>
-        <w:t xml:space="preserve">evict_if_needed_locked 原先每次淘汰都全表扫描整个热点缓存（O(n)），在内存受限、频繁换入换出时灾难性退化。ISVM 驱逐分为 tick_age/16 + C（C 为预取标志与组大小的函数，与时间无关）；淘汰时 tick_ 对所有条目相同，故 argmax 稳定。改为维护一个按 16·C − tick 排序的有序集合，每次取最大键（rbegin），在 O(log n) 内完成淘汰且保持 ISVM 排序不变。</w:t>
+        <w:t xml:space="preserve">上一步让每次命中都要做 ev_index_ 增删，导致缓存越大命中越慢。改为命中只更新 tick、不动有序集合，键变陈旧由驱逐时惰性校正(弹出候选→重算真实键→不符则回插重试)。驱逐质量不变、命中变 O(1)。</w:t>
+      </w:r>
+    </w:p>
+    <w:p>
+      <w:pPr>
+        <w:pStyle w:val="Heading2"/>
+      </w:pPr>
+      <w:r>
+        <w:rPr>
+          <w:rFonts w:ascii="Microsoft YaHei" w:cs="Microsoft YaHei" w:eastAsia="Microsoft YaHei" w:hAnsi="Microsoft YaHei"/>
+        </w:rPr>
+        <w:t xml:space="preserve">3.6  NodeBlock 瘦身 4KB→2KB(v3)</w:t>
+      </w:r>
+    </w:p>
+    <w:p>
+      <w:pPr>
+        <w:spacing w:after="120" w:line="276"/>
+      </w:pPr>
+      <w:r>
+        <w:rPr>
+          <w:rFonts w:ascii="Microsoft YaHei" w:cs="Microsoft YaHei" w:eastAsia="Microsoft YaHei" w:hAnsi="Microsoft YaHei"/>
+          <w:sz w:val="21"/>
+          <w:szCs w:val="21"/>
+        </w:rPr>
+        <w:t xml:space="preserve">neighbor_offsets[8][32](每块 2KB)完全可由 node_offset(邻居id) 现算，属落盘冗余，删除。拆 kHeaderSize=4096(头) 与 kBlockSize=2048(节点)，node_offset = kHeaderSize + id·kBlockSize；预取器改为现算邻居 offset。索引减半、单节点 I/O 减半、同内存缓存翻倍。为破坏性格式变更，旧索引需重建。</w:t>
+      </w:r>
+    </w:p>
+    <w:p>
+      <w:pPr>
+        <w:pStyle w:val="Heading2"/>
+      </w:pPr>
+      <w:r>
+        <w:rPr>
+          <w:rFonts w:ascii="Microsoft YaHei" w:cs="Microsoft YaHei" w:eastAsia="Microsoft YaHei" w:hAnsi="Microsoft YaHei"/>
+        </w:rPr>
+        <w:t xml:space="preserve">3.7  纠正：写链路"空转开销"为冷缓存假象</w:t>
+      </w:r>
+    </w:p>
+    <w:p>
+      <w:pPr>
+        <w:spacing w:after="120" w:line="276"/>
+      </w:pPr>
+      <w:r>
+        <w:rPr>
+          <w:rFonts w:ascii="Microsoft YaHei" w:cs="Microsoft YaHei" w:eastAsia="Microsoft YaHei" w:hAnsi="Microsoft YaHei"/>
+          <w:sz w:val="21"/>
+          <w:szCs w:val="21"/>
+        </w:rPr>
+        <w:t xml:space="preserve">原 v1 报告称 baseline1 比 baseline2 慢约 90ms/query 是写框架空转开销。经暖缓存复测(各模式连跑两次取第二次)：baseline1 与 baseline2 均约 9.7ms、完全一致——证明此前差距是 baseline1 首跑冷缓存所致，写框架空载几乎无开销。该优化项无需进行。</w:t>
       </w:r>
     </w:p>
     <w:p>
@@ -490,7 +525,7 @@
           <w:sz w:val="21"/>
           <w:szCs w:val="21"/>
         </w:rPr>
-        <w:t xml:space="preserve">表 1  召回修复前后（RobustPrune 不等式修正，recompute-gt=1）</w:t>
+        <w:t xml:space="preserve">表 1  召回修复前后(RobustPrune，recompute-gt=1)</w:t>
       </w:r>
     </w:p>
     <w:tbl>
@@ -546,7 +581,7 @@
                 <w:sz w:val="18"/>
                 <w:szCs w:val="18"/>
               </w:rPr>
-              <w:t xml:space="preserve">数据集 / 规模</w:t>
+              <w:t xml:space="preserve">数据集/规模</w:t>
             </w:r>
           </w:p>
         </w:tc>
@@ -648,7 +683,7 @@
                 <w:sz w:val="18"/>
                 <w:szCs w:val="18"/>
               </w:rPr>
-              <w:t xml:space="preserve">修复前 recall@10</w:t>
+              <w:t xml:space="preserve">修复前</w:t>
             </w:r>
           </w:p>
         </w:tc>
@@ -682,7 +717,7 @@
                 <w:sz w:val="18"/>
                 <w:szCs w:val="18"/>
               </w:rPr>
-              <w:t xml:space="preserve">修复后 recall@10</w:t>
+              <w:t xml:space="preserve">修复后</w:t>
             </w:r>
           </w:p>
         </w:tc>
@@ -1359,7 +1394,7 @@
           <w:sz w:val="21"/>
           <w:szCs w:val="21"/>
         </w:rPr>
-        <w:t xml:space="preserve">表 2  SIMD 距离 A/B（同一二进制，AMIO_FORCE_SCALAR 切换；端到端墙钟 = 建图 + 重算GT + 检索）</w:t>
+        <w:t xml:space="preserve">表 2  SIMD 距离 A/B(同二进制 AMIO_FORCE_SCALAR 切换；端到端墙钟)</w:t>
       </w:r>
     </w:p>
     <w:tbl>
@@ -1484,7 +1519,7 @@
                 <w:sz w:val="18"/>
                 <w:szCs w:val="18"/>
               </w:rPr>
-              <w:t xml:space="preserve">标量 (s)</w:t>
+              <w:t xml:space="preserve">标量(s)</w:t>
             </w:r>
           </w:p>
         </w:tc>
@@ -1518,7 +1553,7 @@
                 <w:sz w:val="18"/>
                 <w:szCs w:val="18"/>
               </w:rPr>
-              <w:t xml:space="preserve">SIMD (s)</w:t>
+              <w:t xml:space="preserve">SIMD(s)</w:t>
             </w:r>
           </w:p>
         </w:tc>
@@ -1586,7 +1621,7 @@
                 <w:sz w:val="18"/>
                 <w:szCs w:val="18"/>
               </w:rPr>
-              <w:t xml:space="preserve">recall@10</w:t>
+              <w:t xml:space="preserve">recall</w:t>
             </w:r>
           </w:p>
         </w:tc>
@@ -1986,21 +2021,6 @@
         </w:tc>
       </w:tr>
     </w:tbl>
-    <w:p>
-      <w:pPr>
-        <w:spacing w:after="120" w:line="276"/>
-      </w:pPr>
-      <w:r>
-        <w:rPr>
-          <w:rFonts w:ascii="Microsoft YaHei" w:cs="Microsoft YaHei" w:eastAsia="Microsoft YaHei" w:hAnsi="Microsoft YaHei"/>
-          <w:i/>
-          <w:iCs/>
-          <w:sz w:val="19"/>
-          <w:szCs w:val="19"/>
-        </w:rPr>
-        <w:t xml:space="preserve">说明：端到端倍数被稀释——评测工具的暴力 GT 计算未走 SIMD，是固定开销；引擎内部距离的提速高于此。维度越高 SIMD 收益越大。</w:t>
-      </w:r>
-    </w:p>
     <w:p>
       <w:pPr>
         <w:spacing w:after="60" w:before="120"/>
@@ -2014,7 +2034,7 @@
           <w:sz w:val="21"/>
           <w:szCs w:val="21"/>
         </w:rPr>
-        <w:t xml:space="preserve">表 3  缓存淘汰 O(n) → O(log n)（SIFT 100K，动态缓存 32MB，索引 391MB，recall 全程 1.0）</w:t>
+        <w:t xml:space="preserve">表 3  缓存淘汰 O(n)→O(log n)(SIFT 100K，32MB 动态缓存，recall 全 1.0)</w:t>
       </w:r>
     </w:p>
     <w:tbl>
@@ -2170,7 +2190,7 @@
                 <w:sz w:val="18"/>
                 <w:szCs w:val="18"/>
               </w:rPr>
-              <w:t xml:space="preserve">builtin 平均延迟 (ms)</w:t>
+              <w:t xml:space="preserve">builtin 平均延迟(ms)</w:t>
             </w:r>
           </w:p>
         </w:tc>
@@ -2369,7 +2389,7 @@
                 <w:sz w:val="18"/>
                 <w:szCs w:val="18"/>
               </w:rPr>
-              <w:t xml:space="preserve">learned 平均延迟 (ms)</w:t>
+              <w:t xml:space="preserve">learned 平均延迟(ms)</w:t>
             </w:r>
           </w:p>
         </w:tc>
@@ -2401,7 +2421,7 @@
                 <w:sz w:val="18"/>
                 <w:szCs w:val="18"/>
               </w:rPr>
-              <w:t xml:space="preserve">跑不完（卡死）</w:t>
+              <w:t xml:space="preserve">跑不完</w:t>
             </w:r>
           </w:p>
         </w:tc>
@@ -2434,107 +2454,6 @@
                 <w:szCs w:val="18"/>
               </w:rPr>
               <w:t xml:space="preserve">12.85</w:t>
-            </w:r>
-          </w:p>
-        </w:tc>
-      </w:tr>
-      <w:tr>
-        <w:tc>
-          <w:tcPr>
-            <w:tcW w:type="dxa" w:w="3626"/>
-            <w:tcBorders>
-              <w:top w:val="single" w:color="BBBBBB" w:sz="4"/>
-              <w:left w:val="single" w:color="BBBBBB" w:sz="4"/>
-              <w:bottom w:val="single" w:color="BBBBBB" w:sz="4"/>
-              <w:right w:val="single" w:color="BBBBBB" w:sz="4"/>
-            </w:tcBorders>
-            <w:shd w:fill="EAF1F8" w:val="clear"/>
-            <w:tcMar>
-              <w:top w:type="dxa" w:w="60"/>
-              <w:left w:type="dxa" w:w="100"/>
-              <w:bottom w:type="dxa" w:w="60"/>
-              <w:right w:type="dxa" w:w="100"/>
-            </w:tcMar>
-          </w:tcPr>
-          <w:p>
-            <w:pPr>
-              <w:jc w:val="left"/>
-            </w:pPr>
-            <w:r>
-              <w:rPr>
-                <w:rFonts w:ascii="Microsoft YaHei" w:cs="Microsoft YaHei" w:eastAsia="Microsoft YaHei" w:hAnsi="Microsoft YaHei"/>
-                <w:b w:val="false"/>
-                <w:bCs w:val="false"/>
-                <w:sz w:val="18"/>
-                <w:szCs w:val="18"/>
-              </w:rPr>
-              <w:t xml:space="preserve">learned QPS</w:t>
-            </w:r>
-          </w:p>
-        </w:tc>
-        <w:tc>
-          <w:tcPr>
-            <w:tcW w:type="dxa" w:w="2700"/>
-            <w:tcBorders>
-              <w:top w:val="single" w:color="BBBBBB" w:sz="4"/>
-              <w:left w:val="single" w:color="BBBBBB" w:sz="4"/>
-              <w:bottom w:val="single" w:color="BBBBBB" w:sz="4"/>
-              <w:right w:val="single" w:color="BBBBBB" w:sz="4"/>
-            </w:tcBorders>
-            <w:shd w:fill="EAF1F8" w:val="clear"/>
-            <w:tcMar>
-              <w:top w:type="dxa" w:w="60"/>
-              <w:left w:type="dxa" w:w="100"/>
-              <w:bottom w:type="dxa" w:w="60"/>
-              <w:right w:type="dxa" w:w="100"/>
-            </w:tcMar>
-          </w:tcPr>
-          <w:p>
-            <w:pPr>
-              <w:jc w:val="center"/>
-            </w:pPr>
-            <w:r>
-              <w:rPr>
-                <w:rFonts w:ascii="Microsoft YaHei" w:cs="Microsoft YaHei" w:eastAsia="Microsoft YaHei" w:hAnsi="Microsoft YaHei"/>
-                <w:b w:val="false"/>
-                <w:bCs w:val="false"/>
-                <w:sz w:val="18"/>
-                <w:szCs w:val="18"/>
-              </w:rPr>
-              <w:t xml:space="preserve">—</w:t>
-            </w:r>
-          </w:p>
-        </w:tc>
-        <w:tc>
-          <w:tcPr>
-            <w:tcW w:type="dxa" w:w="2700"/>
-            <w:tcBorders>
-              <w:top w:val="single" w:color="BBBBBB" w:sz="4"/>
-              <w:left w:val="single" w:color="BBBBBB" w:sz="4"/>
-              <w:bottom w:val="single" w:color="BBBBBB" w:sz="4"/>
-              <w:right w:val="single" w:color="BBBBBB" w:sz="4"/>
-            </w:tcBorders>
-            <w:shd w:fill="EAF1F8" w:val="clear"/>
-            <w:tcMar>
-              <w:top w:type="dxa" w:w="60"/>
-              <w:left w:type="dxa" w:w="100"/>
-              <w:bottom w:type="dxa" w:w="60"/>
-              <w:right w:type="dxa" w:w="100"/>
-            </w:tcMar>
-          </w:tcPr>
-          <w:p>
-            <w:pPr>
-              <w:jc w:val="center"/>
-            </w:pPr>
-            <w:r>
-              <w:rPr>
-                <w:rFonts w:ascii="Microsoft YaHei" w:cs="Microsoft YaHei" w:eastAsia="Microsoft YaHei" w:hAnsi="Microsoft YaHei"/>
-                <w:b w:val="false"/>
-                <w:bCs w:val="false"/>
-                <w:sz w:val="18"/>
-                <w:szCs w:val="18"/>
-              </w:rPr>
-              <w:t xml:space="preserve">77.8</w:t>
             </w:r>
           </w:p>
         </w:tc>
@@ -2553,7 +2472,2246 @@
           <w:sz w:val="21"/>
           <w:szCs w:val="21"/>
         </w:rPr>
-        <w:t xml:space="preserve">表 4  BigANN 1M 满内存四模式对比（128维，100 查询，ef=128，recall 全 0.991，数据全驻留 30GB 内存）</w:t>
+        <w:t xml:space="preserve">表 4  缓存命中 O(log n)→O(1)(SIFT 100K，recall 全 1.0，磁盘读数不变)</w:t>
+      </w:r>
+    </w:p>
+    <w:tbl>
+      <w:tblPr>
+        <w:tblW w:type="dxa" w:w="9026"/>
+        <w:tblBorders>
+          <w:top w:val="single" w:color="auto" w:sz="4"/>
+          <w:left w:val="single" w:color="auto" w:sz="4"/>
+          <w:bottom w:val="single" w:color="auto" w:sz="4"/>
+          <w:right w:val="single" w:color="auto" w:sz="4"/>
+          <w:insideH w:val="single" w:color="auto" w:sz="4"/>
+          <w:insideV w:val="single" w:color="auto" w:sz="4"/>
+        </w:tblBorders>
+      </w:tblPr>
+      <w:tblGrid>
+        <w:gridCol w:w="2900"/>
+        <w:gridCol w:w="1626"/>
+        <w:gridCol w:w="2250"/>
+        <w:gridCol w:w="2250"/>
+      </w:tblGrid>
+      <w:tr>
+        <w:trPr>
+          <w:tblHeader/>
+        </w:trPr>
+        <w:tc>
+          <w:tcPr>
+            <w:tcW w:type="dxa" w:w="2900"/>
+            <w:tcBorders>
+              <w:top w:val="single" w:color="BBBBBB" w:sz="4"/>
+              <w:left w:val="single" w:color="BBBBBB" w:sz="4"/>
+              <w:bottom w:val="single" w:color="BBBBBB" w:sz="4"/>
+              <w:right w:val="single" w:color="BBBBBB" w:sz="4"/>
+            </w:tcBorders>
+            <w:shd w:fill="2E74B5" w:val="clear"/>
+            <w:tcMar>
+              <w:top w:type="dxa" w:w="60"/>
+              <w:left w:type="dxa" w:w="100"/>
+              <w:bottom w:type="dxa" w:w="60"/>
+              <w:right w:type="dxa" w:w="100"/>
+            </w:tcMar>
+          </w:tcPr>
+          <w:p>
+            <w:pPr>
+              <w:jc w:val="center"/>
+            </w:pPr>
+            <w:r>
+              <w:rPr>
+                <w:rFonts w:ascii="Microsoft YaHei" w:cs="Microsoft YaHei" w:eastAsia="Microsoft YaHei" w:hAnsi="Microsoft YaHei"/>
+                <w:b/>
+                <w:bCs/>
+                <w:color w:val="FFFFFF"/>
+                <w:sz w:val="18"/>
+                <w:szCs w:val="18"/>
+              </w:rPr>
+              <w:t xml:space="preserve">配置</w:t>
+            </w:r>
+          </w:p>
+        </w:tc>
+        <w:tc>
+          <w:tcPr>
+            <w:tcW w:type="dxa" w:w="1626"/>
+            <w:tcBorders>
+              <w:top w:val="single" w:color="BBBBBB" w:sz="4"/>
+              <w:left w:val="single" w:color="BBBBBB" w:sz="4"/>
+              <w:bottom w:val="single" w:color="BBBBBB" w:sz="4"/>
+              <w:right w:val="single" w:color="BBBBBB" w:sz="4"/>
+            </w:tcBorders>
+            <w:shd w:fill="2E74B5" w:val="clear"/>
+            <w:tcMar>
+              <w:top w:type="dxa" w:w="60"/>
+              <w:left w:type="dxa" w:w="100"/>
+              <w:bottom w:type="dxa" w:w="60"/>
+              <w:right w:type="dxa" w:w="100"/>
+            </w:tcMar>
+          </w:tcPr>
+          <w:p>
+            <w:pPr>
+              <w:jc w:val="center"/>
+            </w:pPr>
+            <w:r>
+              <w:rPr>
+                <w:rFonts w:ascii="Microsoft YaHei" w:cs="Microsoft YaHei" w:eastAsia="Microsoft YaHei" w:hAnsi="Microsoft YaHei"/>
+                <w:b/>
+                <w:bCs/>
+                <w:color w:val="FFFFFF"/>
+                <w:sz w:val="18"/>
+                <w:szCs w:val="18"/>
+              </w:rPr>
+              <w:t xml:space="preserve">指标</w:t>
+            </w:r>
+          </w:p>
+        </w:tc>
+        <w:tc>
+          <w:tcPr>
+            <w:tcW w:type="dxa" w:w="2250"/>
+            <w:tcBorders>
+              <w:top w:val="single" w:color="BBBBBB" w:sz="4"/>
+              <w:left w:val="single" w:color="BBBBBB" w:sz="4"/>
+              <w:bottom w:val="single" w:color="BBBBBB" w:sz="4"/>
+              <w:right w:val="single" w:color="BBBBBB" w:sz="4"/>
+            </w:tcBorders>
+            <w:shd w:fill="2E74B5" w:val="clear"/>
+            <w:tcMar>
+              <w:top w:type="dxa" w:w="60"/>
+              <w:left w:type="dxa" w:w="100"/>
+              <w:bottom w:type="dxa" w:w="60"/>
+              <w:right w:type="dxa" w:w="100"/>
+            </w:tcMar>
+          </w:tcPr>
+          <w:p>
+            <w:pPr>
+              <w:jc w:val="center"/>
+            </w:pPr>
+            <w:r>
+              <w:rPr>
+                <w:rFonts w:ascii="Microsoft YaHei" w:cs="Microsoft YaHei" w:eastAsia="Microsoft YaHei" w:hAnsi="Microsoft YaHei"/>
+                <w:b/>
+                <w:bCs/>
+                <w:color w:val="FFFFFF"/>
+                <w:sz w:val="18"/>
+                <w:szCs w:val="18"/>
+              </w:rPr>
+              <w:t xml:space="preserve">旧 O(log n) 命中</w:t>
+            </w:r>
+          </w:p>
+        </w:tc>
+        <w:tc>
+          <w:tcPr>
+            <w:tcW w:type="dxa" w:w="2250"/>
+            <w:tcBorders>
+              <w:top w:val="single" w:color="BBBBBB" w:sz="4"/>
+              <w:left w:val="single" w:color="BBBBBB" w:sz="4"/>
+              <w:bottom w:val="single" w:color="BBBBBB" w:sz="4"/>
+              <w:right w:val="single" w:color="BBBBBB" w:sz="4"/>
+            </w:tcBorders>
+            <w:shd w:fill="2E74B5" w:val="clear"/>
+            <w:tcMar>
+              <w:top w:type="dxa" w:w="60"/>
+              <w:left w:type="dxa" w:w="100"/>
+              <w:bottom w:type="dxa" w:w="60"/>
+              <w:right w:type="dxa" w:w="100"/>
+            </w:tcMar>
+          </w:tcPr>
+          <w:p>
+            <w:pPr>
+              <w:jc w:val="center"/>
+            </w:pPr>
+            <w:r>
+              <w:rPr>
+                <w:rFonts w:ascii="Microsoft YaHei" w:cs="Microsoft YaHei" w:eastAsia="Microsoft YaHei" w:hAnsi="Microsoft YaHei"/>
+                <w:b/>
+                <w:bCs/>
+                <w:color w:val="FFFFFF"/>
+                <w:sz w:val="18"/>
+                <w:szCs w:val="18"/>
+              </w:rPr>
+              <w:t xml:space="preserve">新 O(1) 命中</w:t>
+            </w:r>
+          </w:p>
+        </w:tc>
+      </w:tr>
+      <w:tr>
+        <w:tc>
+          <w:tcPr>
+            <w:tcW w:type="dxa" w:w="2900"/>
+            <w:tcBorders>
+              <w:top w:val="single" w:color="BBBBBB" w:sz="4"/>
+              <w:left w:val="single" w:color="BBBBBB" w:sz="4"/>
+              <w:bottom w:val="single" w:color="BBBBBB" w:sz="4"/>
+              <w:right w:val="single" w:color="BBBBBB" w:sz="4"/>
+            </w:tcBorders>
+            <w:tcMar>
+              <w:top w:type="dxa" w:w="60"/>
+              <w:left w:type="dxa" w:w="100"/>
+              <w:bottom w:type="dxa" w:w="60"/>
+              <w:right w:type="dxa" w:w="100"/>
+            </w:tcMar>
+          </w:tcPr>
+          <w:p>
+            <w:pPr>
+              <w:jc w:val="left"/>
+            </w:pPr>
+            <w:r>
+              <w:rPr>
+                <w:rFonts w:ascii="Microsoft YaHei" w:cs="Microsoft YaHei" w:eastAsia="Microsoft YaHei" w:hAnsi="Microsoft YaHei"/>
+                <w:b w:val="false"/>
+                <w:bCs w:val="false"/>
+                <w:sz w:val="18"/>
+                <w:szCs w:val="18"/>
+              </w:rPr>
+              <w:t xml:space="preserve">512MB 缓存(命中密集)</w:t>
+            </w:r>
+          </w:p>
+        </w:tc>
+        <w:tc>
+          <w:tcPr>
+            <w:tcW w:type="dxa" w:w="1626"/>
+            <w:tcBorders>
+              <w:top w:val="single" w:color="BBBBBB" w:sz="4"/>
+              <w:left w:val="single" w:color="BBBBBB" w:sz="4"/>
+              <w:bottom w:val="single" w:color="BBBBBB" w:sz="4"/>
+              <w:right w:val="single" w:color="BBBBBB" w:sz="4"/>
+            </w:tcBorders>
+            <w:tcMar>
+              <w:top w:type="dxa" w:w="60"/>
+              <w:left w:type="dxa" w:w="100"/>
+              <w:bottom w:type="dxa" w:w="60"/>
+              <w:right w:type="dxa" w:w="100"/>
+            </w:tcMar>
+          </w:tcPr>
+          <w:p>
+            <w:pPr>
+              <w:jc w:val="left"/>
+            </w:pPr>
+            <w:r>
+              <w:rPr>
+                <w:rFonts w:ascii="Microsoft YaHei" w:cs="Microsoft YaHei" w:eastAsia="Microsoft YaHei" w:hAnsi="Microsoft YaHei"/>
+                <w:b w:val="false"/>
+                <w:bCs w:val="false"/>
+                <w:sz w:val="18"/>
+                <w:szCs w:val="18"/>
+              </w:rPr>
+              <w:t xml:space="preserve">avg(ms)</w:t>
+            </w:r>
+          </w:p>
+        </w:tc>
+        <w:tc>
+          <w:tcPr>
+            <w:tcW w:type="dxa" w:w="2250"/>
+            <w:tcBorders>
+              <w:top w:val="single" w:color="BBBBBB" w:sz="4"/>
+              <w:left w:val="single" w:color="BBBBBB" w:sz="4"/>
+              <w:bottom w:val="single" w:color="BBBBBB" w:sz="4"/>
+              <w:right w:val="single" w:color="BBBBBB" w:sz="4"/>
+            </w:tcBorders>
+            <w:tcMar>
+              <w:top w:type="dxa" w:w="60"/>
+              <w:left w:type="dxa" w:w="100"/>
+              <w:bottom w:type="dxa" w:w="60"/>
+              <w:right w:type="dxa" w:w="100"/>
+            </w:tcMar>
+          </w:tcPr>
+          <w:p>
+            <w:pPr>
+              <w:jc w:val="center"/>
+            </w:pPr>
+            <w:r>
+              <w:rPr>
+                <w:rFonts w:ascii="Microsoft YaHei" w:cs="Microsoft YaHei" w:eastAsia="Microsoft YaHei" w:hAnsi="Microsoft YaHei"/>
+                <w:b w:val="false"/>
+                <w:bCs w:val="false"/>
+                <w:sz w:val="18"/>
+                <w:szCs w:val="18"/>
+              </w:rPr>
+              <w:t xml:space="preserve">53.3</w:t>
+            </w:r>
+          </w:p>
+        </w:tc>
+        <w:tc>
+          <w:tcPr>
+            <w:tcW w:type="dxa" w:w="2250"/>
+            <w:tcBorders>
+              <w:top w:val="single" w:color="BBBBBB" w:sz="4"/>
+              <w:left w:val="single" w:color="BBBBBB" w:sz="4"/>
+              <w:bottom w:val="single" w:color="BBBBBB" w:sz="4"/>
+              <w:right w:val="single" w:color="BBBBBB" w:sz="4"/>
+            </w:tcBorders>
+            <w:tcMar>
+              <w:top w:type="dxa" w:w="60"/>
+              <w:left w:type="dxa" w:w="100"/>
+              <w:bottom w:type="dxa" w:w="60"/>
+              <w:right w:type="dxa" w:w="100"/>
+            </w:tcMar>
+          </w:tcPr>
+          <w:p>
+            <w:pPr>
+              <w:jc w:val="center"/>
+            </w:pPr>
+            <w:r>
+              <w:rPr>
+                <w:rFonts w:ascii="Microsoft YaHei" w:cs="Microsoft YaHei" w:eastAsia="Microsoft YaHei" w:hAnsi="Microsoft YaHei"/>
+                <w:b w:val="false"/>
+                <w:bCs w:val="false"/>
+                <w:sz w:val="18"/>
+                <w:szCs w:val="18"/>
+              </w:rPr>
+              <w:t xml:space="preserve">9.76</w:t>
+            </w:r>
+          </w:p>
+        </w:tc>
+      </w:tr>
+      <w:tr>
+        <w:tc>
+          <w:tcPr>
+            <w:tcW w:type="dxa" w:w="2900"/>
+            <w:tcBorders>
+              <w:top w:val="single" w:color="BBBBBB" w:sz="4"/>
+              <w:left w:val="single" w:color="BBBBBB" w:sz="4"/>
+              <w:bottom w:val="single" w:color="BBBBBB" w:sz="4"/>
+              <w:right w:val="single" w:color="BBBBBB" w:sz="4"/>
+            </w:tcBorders>
+            <w:shd w:fill="EAF1F8" w:val="clear"/>
+            <w:tcMar>
+              <w:top w:type="dxa" w:w="60"/>
+              <w:left w:type="dxa" w:w="100"/>
+              <w:bottom w:type="dxa" w:w="60"/>
+              <w:right w:type="dxa" w:w="100"/>
+            </w:tcMar>
+          </w:tcPr>
+          <w:p>
+            <w:pPr>
+              <w:jc w:val="left"/>
+            </w:pPr>
+            <w:r>
+              <w:rPr>
+                <w:rFonts w:ascii="Microsoft YaHei" w:cs="Microsoft YaHei" w:eastAsia="Microsoft YaHei" w:hAnsi="Microsoft YaHei"/>
+                <w:b w:val="false"/>
+                <w:bCs w:val="false"/>
+                <w:sz w:val="18"/>
+                <w:szCs w:val="18"/>
+              </w:rPr>
+              <w:t xml:space="preserve"/>
+            </w:r>
+          </w:p>
+        </w:tc>
+        <w:tc>
+          <w:tcPr>
+            <w:tcW w:type="dxa" w:w="1626"/>
+            <w:tcBorders>
+              <w:top w:val="single" w:color="BBBBBB" w:sz="4"/>
+              <w:left w:val="single" w:color="BBBBBB" w:sz="4"/>
+              <w:bottom w:val="single" w:color="BBBBBB" w:sz="4"/>
+              <w:right w:val="single" w:color="BBBBBB" w:sz="4"/>
+            </w:tcBorders>
+            <w:shd w:fill="EAF1F8" w:val="clear"/>
+            <w:tcMar>
+              <w:top w:type="dxa" w:w="60"/>
+              <w:left w:type="dxa" w:w="100"/>
+              <w:bottom w:type="dxa" w:w="60"/>
+              <w:right w:type="dxa" w:w="100"/>
+            </w:tcMar>
+          </w:tcPr>
+          <w:p>
+            <w:pPr>
+              <w:jc w:val="left"/>
+            </w:pPr>
+            <w:r>
+              <w:rPr>
+                <w:rFonts w:ascii="Microsoft YaHei" w:cs="Microsoft YaHei" w:eastAsia="Microsoft YaHei" w:hAnsi="Microsoft YaHei"/>
+                <w:b w:val="false"/>
+                <w:bCs w:val="false"/>
+                <w:sz w:val="18"/>
+                <w:szCs w:val="18"/>
+              </w:rPr>
+              <w:t xml:space="preserve">p99(ms)</w:t>
+            </w:r>
+          </w:p>
+        </w:tc>
+        <w:tc>
+          <w:tcPr>
+            <w:tcW w:type="dxa" w:w="2250"/>
+            <w:tcBorders>
+              <w:top w:val="single" w:color="BBBBBB" w:sz="4"/>
+              <w:left w:val="single" w:color="BBBBBB" w:sz="4"/>
+              <w:bottom w:val="single" w:color="BBBBBB" w:sz="4"/>
+              <w:right w:val="single" w:color="BBBBBB" w:sz="4"/>
+            </w:tcBorders>
+            <w:shd w:fill="EAF1F8" w:val="clear"/>
+            <w:tcMar>
+              <w:top w:type="dxa" w:w="60"/>
+              <w:left w:type="dxa" w:w="100"/>
+              <w:bottom w:type="dxa" w:w="60"/>
+              <w:right w:type="dxa" w:w="100"/>
+            </w:tcMar>
+          </w:tcPr>
+          <w:p>
+            <w:pPr>
+              <w:jc w:val="center"/>
+            </w:pPr>
+            <w:r>
+              <w:rPr>
+                <w:rFonts w:ascii="Microsoft YaHei" w:cs="Microsoft YaHei" w:eastAsia="Microsoft YaHei" w:hAnsi="Microsoft YaHei"/>
+                <w:b w:val="false"/>
+                <w:bCs w:val="false"/>
+                <w:sz w:val="18"/>
+                <w:szCs w:val="18"/>
+              </w:rPr>
+              <w:t xml:space="preserve">298.8</w:t>
+            </w:r>
+          </w:p>
+        </w:tc>
+        <w:tc>
+          <w:tcPr>
+            <w:tcW w:type="dxa" w:w="2250"/>
+            <w:tcBorders>
+              <w:top w:val="single" w:color="BBBBBB" w:sz="4"/>
+              <w:left w:val="single" w:color="BBBBBB" w:sz="4"/>
+              <w:bottom w:val="single" w:color="BBBBBB" w:sz="4"/>
+              <w:right w:val="single" w:color="BBBBBB" w:sz="4"/>
+            </w:tcBorders>
+            <w:shd w:fill="EAF1F8" w:val="clear"/>
+            <w:tcMar>
+              <w:top w:type="dxa" w:w="60"/>
+              <w:left w:type="dxa" w:w="100"/>
+              <w:bottom w:type="dxa" w:w="60"/>
+              <w:right w:type="dxa" w:w="100"/>
+            </w:tcMar>
+          </w:tcPr>
+          <w:p>
+            <w:pPr>
+              <w:jc w:val="center"/>
+            </w:pPr>
+            <w:r>
+              <w:rPr>
+                <w:rFonts w:ascii="Microsoft YaHei" w:cs="Microsoft YaHei" w:eastAsia="Microsoft YaHei" w:hAnsi="Microsoft YaHei"/>
+                <w:b w:val="false"/>
+                <w:bCs w:val="false"/>
+                <w:sz w:val="18"/>
+                <w:szCs w:val="18"/>
+              </w:rPr>
+              <w:t xml:space="preserve">31.7</w:t>
+            </w:r>
+          </w:p>
+        </w:tc>
+      </w:tr>
+      <w:tr>
+        <w:tc>
+          <w:tcPr>
+            <w:tcW w:type="dxa" w:w="2900"/>
+            <w:tcBorders>
+              <w:top w:val="single" w:color="BBBBBB" w:sz="4"/>
+              <w:left w:val="single" w:color="BBBBBB" w:sz="4"/>
+              <w:bottom w:val="single" w:color="BBBBBB" w:sz="4"/>
+              <w:right w:val="single" w:color="BBBBBB" w:sz="4"/>
+            </w:tcBorders>
+            <w:tcMar>
+              <w:top w:type="dxa" w:w="60"/>
+              <w:left w:type="dxa" w:w="100"/>
+              <w:bottom w:type="dxa" w:w="60"/>
+              <w:right w:type="dxa" w:w="100"/>
+            </w:tcMar>
+          </w:tcPr>
+          <w:p>
+            <w:pPr>
+              <w:jc w:val="left"/>
+            </w:pPr>
+            <w:r>
+              <w:rPr>
+                <w:rFonts w:ascii="Microsoft YaHei" w:cs="Microsoft YaHei" w:eastAsia="Microsoft YaHei" w:hAnsi="Microsoft YaHei"/>
+                <w:b w:val="false"/>
+                <w:bCs w:val="false"/>
+                <w:sz w:val="18"/>
+                <w:szCs w:val="18"/>
+              </w:rPr>
+              <w:t xml:space="preserve"/>
+            </w:r>
+          </w:p>
+        </w:tc>
+        <w:tc>
+          <w:tcPr>
+            <w:tcW w:type="dxa" w:w="1626"/>
+            <w:tcBorders>
+              <w:top w:val="single" w:color="BBBBBB" w:sz="4"/>
+              <w:left w:val="single" w:color="BBBBBB" w:sz="4"/>
+              <w:bottom w:val="single" w:color="BBBBBB" w:sz="4"/>
+              <w:right w:val="single" w:color="BBBBBB" w:sz="4"/>
+            </w:tcBorders>
+            <w:tcMar>
+              <w:top w:type="dxa" w:w="60"/>
+              <w:left w:type="dxa" w:w="100"/>
+              <w:bottom w:type="dxa" w:w="60"/>
+              <w:right w:type="dxa" w:w="100"/>
+            </w:tcMar>
+          </w:tcPr>
+          <w:p>
+            <w:pPr>
+              <w:jc w:val="left"/>
+            </w:pPr>
+            <w:r>
+              <w:rPr>
+                <w:rFonts w:ascii="Microsoft YaHei" w:cs="Microsoft YaHei" w:eastAsia="Microsoft YaHei" w:hAnsi="Microsoft YaHei"/>
+                <w:b w:val="false"/>
+                <w:bCs w:val="false"/>
+                <w:sz w:val="18"/>
+                <w:szCs w:val="18"/>
+              </w:rPr>
+              <w:t xml:space="preserve">QPS</w:t>
+            </w:r>
+          </w:p>
+        </w:tc>
+        <w:tc>
+          <w:tcPr>
+            <w:tcW w:type="dxa" w:w="2250"/>
+            <w:tcBorders>
+              <w:top w:val="single" w:color="BBBBBB" w:sz="4"/>
+              <w:left w:val="single" w:color="BBBBBB" w:sz="4"/>
+              <w:bottom w:val="single" w:color="BBBBBB" w:sz="4"/>
+              <w:right w:val="single" w:color="BBBBBB" w:sz="4"/>
+            </w:tcBorders>
+            <w:tcMar>
+              <w:top w:type="dxa" w:w="60"/>
+              <w:left w:type="dxa" w:w="100"/>
+              <w:bottom w:type="dxa" w:w="60"/>
+              <w:right w:type="dxa" w:w="100"/>
+            </w:tcMar>
+          </w:tcPr>
+          <w:p>
+            <w:pPr>
+              <w:jc w:val="center"/>
+            </w:pPr>
+            <w:r>
+              <w:rPr>
+                <w:rFonts w:ascii="Microsoft YaHei" w:cs="Microsoft YaHei" w:eastAsia="Microsoft YaHei" w:hAnsi="Microsoft YaHei"/>
+                <w:b w:val="false"/>
+                <w:bCs w:val="false"/>
+                <w:sz w:val="18"/>
+                <w:szCs w:val="18"/>
+              </w:rPr>
+              <w:t xml:space="preserve">18.8</w:t>
+            </w:r>
+          </w:p>
+        </w:tc>
+        <w:tc>
+          <w:tcPr>
+            <w:tcW w:type="dxa" w:w="2250"/>
+            <w:tcBorders>
+              <w:top w:val="single" w:color="BBBBBB" w:sz="4"/>
+              <w:left w:val="single" w:color="BBBBBB" w:sz="4"/>
+              <w:bottom w:val="single" w:color="BBBBBB" w:sz="4"/>
+              <w:right w:val="single" w:color="BBBBBB" w:sz="4"/>
+            </w:tcBorders>
+            <w:tcMar>
+              <w:top w:type="dxa" w:w="60"/>
+              <w:left w:type="dxa" w:w="100"/>
+              <w:bottom w:type="dxa" w:w="60"/>
+              <w:right w:type="dxa" w:w="100"/>
+            </w:tcMar>
+          </w:tcPr>
+          <w:p>
+            <w:pPr>
+              <w:jc w:val="center"/>
+            </w:pPr>
+            <w:r>
+              <w:rPr>
+                <w:rFonts w:ascii="Microsoft YaHei" w:cs="Microsoft YaHei" w:eastAsia="Microsoft YaHei" w:hAnsi="Microsoft YaHei"/>
+                <w:b w:val="false"/>
+                <w:bCs w:val="false"/>
+                <w:sz w:val="18"/>
+                <w:szCs w:val="18"/>
+              </w:rPr>
+              <w:t xml:space="preserve">102.4</w:t>
+            </w:r>
+          </w:p>
+        </w:tc>
+      </w:tr>
+      <w:tr>
+        <w:tc>
+          <w:tcPr>
+            <w:tcW w:type="dxa" w:w="2900"/>
+            <w:tcBorders>
+              <w:top w:val="single" w:color="BBBBBB" w:sz="4"/>
+              <w:left w:val="single" w:color="BBBBBB" w:sz="4"/>
+              <w:bottom w:val="single" w:color="BBBBBB" w:sz="4"/>
+              <w:right w:val="single" w:color="BBBBBB" w:sz="4"/>
+            </w:tcBorders>
+            <w:shd w:fill="EAF1F8" w:val="clear"/>
+            <w:tcMar>
+              <w:top w:type="dxa" w:w="60"/>
+              <w:left w:type="dxa" w:w="100"/>
+              <w:bottom w:type="dxa" w:w="60"/>
+              <w:right w:type="dxa" w:w="100"/>
+            </w:tcMar>
+          </w:tcPr>
+          <w:p>
+            <w:pPr>
+              <w:jc w:val="left"/>
+            </w:pPr>
+            <w:r>
+              <w:rPr>
+                <w:rFonts w:ascii="Microsoft YaHei" w:cs="Microsoft YaHei" w:eastAsia="Microsoft YaHei" w:hAnsi="Microsoft YaHei"/>
+                <w:b w:val="false"/>
+                <w:bCs w:val="false"/>
+                <w:sz w:val="18"/>
+                <w:szCs w:val="18"/>
+              </w:rPr>
+              <w:t xml:space="preserve">32MB 缓存(换入换出)</w:t>
+            </w:r>
+          </w:p>
+        </w:tc>
+        <w:tc>
+          <w:tcPr>
+            <w:tcW w:type="dxa" w:w="1626"/>
+            <w:tcBorders>
+              <w:top w:val="single" w:color="BBBBBB" w:sz="4"/>
+              <w:left w:val="single" w:color="BBBBBB" w:sz="4"/>
+              <w:bottom w:val="single" w:color="BBBBBB" w:sz="4"/>
+              <w:right w:val="single" w:color="BBBBBB" w:sz="4"/>
+            </w:tcBorders>
+            <w:shd w:fill="EAF1F8" w:val="clear"/>
+            <w:tcMar>
+              <w:top w:type="dxa" w:w="60"/>
+              <w:left w:type="dxa" w:w="100"/>
+              <w:bottom w:type="dxa" w:w="60"/>
+              <w:right w:type="dxa" w:w="100"/>
+            </w:tcMar>
+          </w:tcPr>
+          <w:p>
+            <w:pPr>
+              <w:jc w:val="left"/>
+            </w:pPr>
+            <w:r>
+              <w:rPr>
+                <w:rFonts w:ascii="Microsoft YaHei" w:cs="Microsoft YaHei" w:eastAsia="Microsoft YaHei" w:hAnsi="Microsoft YaHei"/>
+                <w:b w:val="false"/>
+                <w:bCs w:val="false"/>
+                <w:sz w:val="18"/>
+                <w:szCs w:val="18"/>
+              </w:rPr>
+              <w:t xml:space="preserve">avg(ms)</w:t>
+            </w:r>
+          </w:p>
+        </w:tc>
+        <w:tc>
+          <w:tcPr>
+            <w:tcW w:type="dxa" w:w="2250"/>
+            <w:tcBorders>
+              <w:top w:val="single" w:color="BBBBBB" w:sz="4"/>
+              <w:left w:val="single" w:color="BBBBBB" w:sz="4"/>
+              <w:bottom w:val="single" w:color="BBBBBB" w:sz="4"/>
+              <w:right w:val="single" w:color="BBBBBB" w:sz="4"/>
+            </w:tcBorders>
+            <w:shd w:fill="EAF1F8" w:val="clear"/>
+            <w:tcMar>
+              <w:top w:type="dxa" w:w="60"/>
+              <w:left w:type="dxa" w:w="100"/>
+              <w:bottom w:type="dxa" w:w="60"/>
+              <w:right w:type="dxa" w:w="100"/>
+            </w:tcMar>
+          </w:tcPr>
+          <w:p>
+            <w:pPr>
+              <w:jc w:val="center"/>
+            </w:pPr>
+            <w:r>
+              <w:rPr>
+                <w:rFonts w:ascii="Microsoft YaHei" w:cs="Microsoft YaHei" w:eastAsia="Microsoft YaHei" w:hAnsi="Microsoft YaHei"/>
+                <w:b w:val="false"/>
+                <w:bCs w:val="false"/>
+                <w:sz w:val="18"/>
+                <w:szCs w:val="18"/>
+              </w:rPr>
+              <w:t xml:space="preserve">17.0</w:t>
+            </w:r>
+          </w:p>
+        </w:tc>
+        <w:tc>
+          <w:tcPr>
+            <w:tcW w:type="dxa" w:w="2250"/>
+            <w:tcBorders>
+              <w:top w:val="single" w:color="BBBBBB" w:sz="4"/>
+              <w:left w:val="single" w:color="BBBBBB" w:sz="4"/>
+              <w:bottom w:val="single" w:color="BBBBBB" w:sz="4"/>
+              <w:right w:val="single" w:color="BBBBBB" w:sz="4"/>
+            </w:tcBorders>
+            <w:shd w:fill="EAF1F8" w:val="clear"/>
+            <w:tcMar>
+              <w:top w:type="dxa" w:w="60"/>
+              <w:left w:type="dxa" w:w="100"/>
+              <w:bottom w:type="dxa" w:w="60"/>
+              <w:right w:type="dxa" w:w="100"/>
+            </w:tcMar>
+          </w:tcPr>
+          <w:p>
+            <w:pPr>
+              <w:jc w:val="center"/>
+            </w:pPr>
+            <w:r>
+              <w:rPr>
+                <w:rFonts w:ascii="Microsoft YaHei" w:cs="Microsoft YaHei" w:eastAsia="Microsoft YaHei" w:hAnsi="Microsoft YaHei"/>
+                <w:b w:val="false"/>
+                <w:bCs w:val="false"/>
+                <w:sz w:val="18"/>
+                <w:szCs w:val="18"/>
+              </w:rPr>
+              <w:t xml:space="preserve">16.4(≈)</w:t>
+            </w:r>
+          </w:p>
+        </w:tc>
+      </w:tr>
+    </w:tbl>
+    <w:p>
+      <w:pPr>
+        <w:spacing w:after="60" w:before="120"/>
+      </w:pPr>
+      <w:r>
+        <w:rPr>
+          <w:rFonts w:ascii="Microsoft YaHei" w:cs="Microsoft YaHei" w:eastAsia="Microsoft YaHei" w:hAnsi="Microsoft YaHei"/>
+          <w:b/>
+          <w:bCs/>
+          <w:color w:val="2E74B5"/>
+          <w:sz w:val="21"/>
+          <w:szCs w:val="21"/>
+        </w:rPr>
+        <w:t xml:space="preserve">表 5  写框架验证(SIFT 100K，暖缓存连跑两次取第二次)——证明无空转开销</w:t>
+      </w:r>
+    </w:p>
+    <w:tbl>
+      <w:tblPr>
+        <w:tblW w:type="dxa" w:w="9026"/>
+        <w:tblBorders>
+          <w:top w:val="single" w:color="auto" w:sz="4"/>
+          <w:left w:val="single" w:color="auto" w:sz="4"/>
+          <w:bottom w:val="single" w:color="auto" w:sz="4"/>
+          <w:right w:val="single" w:color="auto" w:sz="4"/>
+          <w:insideH w:val="single" w:color="auto" w:sz="4"/>
+          <w:insideV w:val="single" w:color="auto" w:sz="4"/>
+        </w:tblBorders>
+      </w:tblPr>
+      <w:tblGrid>
+        <w:gridCol w:w="3026"/>
+        <w:gridCol w:w="2000"/>
+        <w:gridCol w:w="2000"/>
+        <w:gridCol w:w="2000"/>
+      </w:tblGrid>
+      <w:tr>
+        <w:trPr>
+          <w:tblHeader/>
+        </w:trPr>
+        <w:tc>
+          <w:tcPr>
+            <w:tcW w:type="dxa" w:w="3026"/>
+            <w:tcBorders>
+              <w:top w:val="single" w:color="BBBBBB" w:sz="4"/>
+              <w:left w:val="single" w:color="BBBBBB" w:sz="4"/>
+              <w:bottom w:val="single" w:color="BBBBBB" w:sz="4"/>
+              <w:right w:val="single" w:color="BBBBBB" w:sz="4"/>
+            </w:tcBorders>
+            <w:shd w:fill="2E74B5" w:val="clear"/>
+            <w:tcMar>
+              <w:top w:type="dxa" w:w="60"/>
+              <w:left w:type="dxa" w:w="100"/>
+              <w:bottom w:type="dxa" w:w="60"/>
+              <w:right w:type="dxa" w:w="100"/>
+            </w:tcMar>
+          </w:tcPr>
+          <w:p>
+            <w:pPr>
+              <w:jc w:val="center"/>
+            </w:pPr>
+            <w:r>
+              <w:rPr>
+                <w:rFonts w:ascii="Microsoft YaHei" w:cs="Microsoft YaHei" w:eastAsia="Microsoft YaHei" w:hAnsi="Microsoft YaHei"/>
+                <w:b/>
+                <w:bCs/>
+                <w:color w:val="FFFFFF"/>
+                <w:sz w:val="18"/>
+                <w:szCs w:val="18"/>
+              </w:rPr>
+              <w:t xml:space="preserve">模式(暖缓存)</w:t>
+            </w:r>
+          </w:p>
+        </w:tc>
+        <w:tc>
+          <w:tcPr>
+            <w:tcW w:type="dxa" w:w="2000"/>
+            <w:tcBorders>
+              <w:top w:val="single" w:color="BBBBBB" w:sz="4"/>
+              <w:left w:val="single" w:color="BBBBBB" w:sz="4"/>
+              <w:bottom w:val="single" w:color="BBBBBB" w:sz="4"/>
+              <w:right w:val="single" w:color="BBBBBB" w:sz="4"/>
+            </w:tcBorders>
+            <w:shd w:fill="2E74B5" w:val="clear"/>
+            <w:tcMar>
+              <w:top w:type="dxa" w:w="60"/>
+              <w:left w:type="dxa" w:w="100"/>
+              <w:bottom w:type="dxa" w:w="60"/>
+              <w:right w:type="dxa" w:w="100"/>
+            </w:tcMar>
+          </w:tcPr>
+          <w:p>
+            <w:pPr>
+              <w:jc w:val="center"/>
+            </w:pPr>
+            <w:r>
+              <w:rPr>
+                <w:rFonts w:ascii="Microsoft YaHei" w:cs="Microsoft YaHei" w:eastAsia="Microsoft YaHei" w:hAnsi="Microsoft YaHei"/>
+                <w:b/>
+                <w:bCs/>
+                <w:color w:val="FFFFFF"/>
+                <w:sz w:val="18"/>
+                <w:szCs w:val="18"/>
+              </w:rPr>
+              <w:t xml:space="preserve">avg(ms)</w:t>
+            </w:r>
+          </w:p>
+        </w:tc>
+        <w:tc>
+          <w:tcPr>
+            <w:tcW w:type="dxa" w:w="2000"/>
+            <w:tcBorders>
+              <w:top w:val="single" w:color="BBBBBB" w:sz="4"/>
+              <w:left w:val="single" w:color="BBBBBB" w:sz="4"/>
+              <w:bottom w:val="single" w:color="BBBBBB" w:sz="4"/>
+              <w:right w:val="single" w:color="BBBBBB" w:sz="4"/>
+            </w:tcBorders>
+            <w:shd w:fill="2E74B5" w:val="clear"/>
+            <w:tcMar>
+              <w:top w:type="dxa" w:w="60"/>
+              <w:left w:type="dxa" w:w="100"/>
+              <w:bottom w:type="dxa" w:w="60"/>
+              <w:right w:type="dxa" w:w="100"/>
+            </w:tcMar>
+          </w:tcPr>
+          <w:p>
+            <w:pPr>
+              <w:jc w:val="center"/>
+            </w:pPr>
+            <w:r>
+              <w:rPr>
+                <w:rFonts w:ascii="Microsoft YaHei" w:cs="Microsoft YaHei" w:eastAsia="Microsoft YaHei" w:hAnsi="Microsoft YaHei"/>
+                <w:b/>
+                <w:bCs/>
+                <w:color w:val="FFFFFF"/>
+                <w:sz w:val="18"/>
+                <w:szCs w:val="18"/>
+              </w:rPr>
+              <w:t xml:space="preserve">QPS</w:t>
+            </w:r>
+          </w:p>
+        </w:tc>
+        <w:tc>
+          <w:tcPr>
+            <w:tcW w:type="dxa" w:w="2000"/>
+            <w:tcBorders>
+              <w:top w:val="single" w:color="BBBBBB" w:sz="4"/>
+              <w:left w:val="single" w:color="BBBBBB" w:sz="4"/>
+              <w:bottom w:val="single" w:color="BBBBBB" w:sz="4"/>
+              <w:right w:val="single" w:color="BBBBBB" w:sz="4"/>
+            </w:tcBorders>
+            <w:shd w:fill="2E74B5" w:val="clear"/>
+            <w:tcMar>
+              <w:top w:type="dxa" w:w="60"/>
+              <w:left w:type="dxa" w:w="100"/>
+              <w:bottom w:type="dxa" w:w="60"/>
+              <w:right w:type="dxa" w:w="100"/>
+            </w:tcMar>
+          </w:tcPr>
+          <w:p>
+            <w:pPr>
+              <w:jc w:val="center"/>
+            </w:pPr>
+            <w:r>
+              <w:rPr>
+                <w:rFonts w:ascii="Microsoft YaHei" w:cs="Microsoft YaHei" w:eastAsia="Microsoft YaHei" w:hAnsi="Microsoft YaHei"/>
+                <w:b/>
+                <w:bCs/>
+                <w:color w:val="FFFFFF"/>
+                <w:sz w:val="18"/>
+                <w:szCs w:val="18"/>
+              </w:rPr>
+              <w:t xml:space="preserve">磁盘块读</w:t>
+            </w:r>
+          </w:p>
+        </w:tc>
+      </w:tr>
+      <w:tr>
+        <w:tc>
+          <w:tcPr>
+            <w:tcW w:type="dxa" w:w="3026"/>
+            <w:tcBorders>
+              <w:top w:val="single" w:color="BBBBBB" w:sz="4"/>
+              <w:left w:val="single" w:color="BBBBBB" w:sz="4"/>
+              <w:bottom w:val="single" w:color="BBBBBB" w:sz="4"/>
+              <w:right w:val="single" w:color="BBBBBB" w:sz="4"/>
+            </w:tcBorders>
+            <w:tcMar>
+              <w:top w:type="dxa" w:w="60"/>
+              <w:left w:type="dxa" w:w="100"/>
+              <w:bottom w:type="dxa" w:w="60"/>
+              <w:right w:type="dxa" w:w="100"/>
+            </w:tcMar>
+          </w:tcPr>
+          <w:p>
+            <w:pPr>
+              <w:jc w:val="left"/>
+            </w:pPr>
+            <w:r>
+              <w:rPr>
+                <w:rFonts w:ascii="Microsoft YaHei" w:cs="Microsoft YaHei" w:eastAsia="Microsoft YaHei" w:hAnsi="Microsoft YaHei"/>
+                <w:b w:val="false"/>
+                <w:bCs w:val="false"/>
+                <w:sz w:val="18"/>
+                <w:szCs w:val="18"/>
+              </w:rPr>
+              <w:t xml:space="preserve">baseline1(写框架开)</w:t>
+            </w:r>
+          </w:p>
+        </w:tc>
+        <w:tc>
+          <w:tcPr>
+            <w:tcW w:type="dxa" w:w="2000"/>
+            <w:tcBorders>
+              <w:top w:val="single" w:color="BBBBBB" w:sz="4"/>
+              <w:left w:val="single" w:color="BBBBBB" w:sz="4"/>
+              <w:bottom w:val="single" w:color="BBBBBB" w:sz="4"/>
+              <w:right w:val="single" w:color="BBBBBB" w:sz="4"/>
+            </w:tcBorders>
+            <w:tcMar>
+              <w:top w:type="dxa" w:w="60"/>
+              <w:left w:type="dxa" w:w="100"/>
+              <w:bottom w:type="dxa" w:w="60"/>
+              <w:right w:type="dxa" w:w="100"/>
+            </w:tcMar>
+          </w:tcPr>
+          <w:p>
+            <w:pPr>
+              <w:jc w:val="center"/>
+            </w:pPr>
+            <w:r>
+              <w:rPr>
+                <w:rFonts w:ascii="Microsoft YaHei" w:cs="Microsoft YaHei" w:eastAsia="Microsoft YaHei" w:hAnsi="Microsoft YaHei"/>
+                <w:b w:val="false"/>
+                <w:bCs w:val="false"/>
+                <w:sz w:val="18"/>
+                <w:szCs w:val="18"/>
+              </w:rPr>
+              <w:t xml:space="preserve">9.78</w:t>
+            </w:r>
+          </w:p>
+        </w:tc>
+        <w:tc>
+          <w:tcPr>
+            <w:tcW w:type="dxa" w:w="2000"/>
+            <w:tcBorders>
+              <w:top w:val="single" w:color="BBBBBB" w:sz="4"/>
+              <w:left w:val="single" w:color="BBBBBB" w:sz="4"/>
+              <w:bottom w:val="single" w:color="BBBBBB" w:sz="4"/>
+              <w:right w:val="single" w:color="BBBBBB" w:sz="4"/>
+            </w:tcBorders>
+            <w:tcMar>
+              <w:top w:type="dxa" w:w="60"/>
+              <w:left w:type="dxa" w:w="100"/>
+              <w:bottom w:type="dxa" w:w="60"/>
+              <w:right w:type="dxa" w:w="100"/>
+            </w:tcMar>
+          </w:tcPr>
+          <w:p>
+            <w:pPr>
+              <w:jc w:val="center"/>
+            </w:pPr>
+            <w:r>
+              <w:rPr>
+                <w:rFonts w:ascii="Microsoft YaHei" w:cs="Microsoft YaHei" w:eastAsia="Microsoft YaHei" w:hAnsi="Microsoft YaHei"/>
+                <w:b w:val="false"/>
+                <w:bCs w:val="false"/>
+                <w:sz w:val="18"/>
+                <w:szCs w:val="18"/>
+              </w:rPr>
+              <w:t xml:space="preserve">102.2</w:t>
+            </w:r>
+          </w:p>
+        </w:tc>
+        <w:tc>
+          <w:tcPr>
+            <w:tcW w:type="dxa" w:w="2000"/>
+            <w:tcBorders>
+              <w:top w:val="single" w:color="BBBBBB" w:sz="4"/>
+              <w:left w:val="single" w:color="BBBBBB" w:sz="4"/>
+              <w:bottom w:val="single" w:color="BBBBBB" w:sz="4"/>
+              <w:right w:val="single" w:color="BBBBBB" w:sz="4"/>
+            </w:tcBorders>
+            <w:tcMar>
+              <w:top w:type="dxa" w:w="60"/>
+              <w:left w:type="dxa" w:w="100"/>
+              <w:bottom w:type="dxa" w:w="60"/>
+              <w:right w:type="dxa" w:w="100"/>
+            </w:tcMar>
+          </w:tcPr>
+          <w:p>
+            <w:pPr>
+              <w:jc w:val="center"/>
+            </w:pPr>
+            <w:r>
+              <w:rPr>
+                <w:rFonts w:ascii="Microsoft YaHei" w:cs="Microsoft YaHei" w:eastAsia="Microsoft YaHei" w:hAnsi="Microsoft YaHei"/>
+                <w:b w:val="false"/>
+                <w:bCs w:val="false"/>
+                <w:sz w:val="18"/>
+                <w:szCs w:val="18"/>
+              </w:rPr>
+              <w:t xml:space="preserve">93,728</w:t>
+            </w:r>
+          </w:p>
+        </w:tc>
+      </w:tr>
+      <w:tr>
+        <w:tc>
+          <w:tcPr>
+            <w:tcW w:type="dxa" w:w="3026"/>
+            <w:tcBorders>
+              <w:top w:val="single" w:color="BBBBBB" w:sz="4"/>
+              <w:left w:val="single" w:color="BBBBBB" w:sz="4"/>
+              <w:bottom w:val="single" w:color="BBBBBB" w:sz="4"/>
+              <w:right w:val="single" w:color="BBBBBB" w:sz="4"/>
+            </w:tcBorders>
+            <w:shd w:fill="EAF1F8" w:val="clear"/>
+            <w:tcMar>
+              <w:top w:type="dxa" w:w="60"/>
+              <w:left w:type="dxa" w:w="100"/>
+              <w:bottom w:type="dxa" w:w="60"/>
+              <w:right w:type="dxa" w:w="100"/>
+            </w:tcMar>
+          </w:tcPr>
+          <w:p>
+            <w:pPr>
+              <w:jc w:val="left"/>
+            </w:pPr>
+            <w:r>
+              <w:rPr>
+                <w:rFonts w:ascii="Microsoft YaHei" w:cs="Microsoft YaHei" w:eastAsia="Microsoft YaHei" w:hAnsi="Microsoft YaHei"/>
+                <w:b w:val="false"/>
+                <w:bCs w:val="false"/>
+                <w:sz w:val="18"/>
+                <w:szCs w:val="18"/>
+              </w:rPr>
+              <w:t xml:space="preserve">baseline2(写框架关)</w:t>
+            </w:r>
+          </w:p>
+        </w:tc>
+        <w:tc>
+          <w:tcPr>
+            <w:tcW w:type="dxa" w:w="2000"/>
+            <w:tcBorders>
+              <w:top w:val="single" w:color="BBBBBB" w:sz="4"/>
+              <w:left w:val="single" w:color="BBBBBB" w:sz="4"/>
+              <w:bottom w:val="single" w:color="BBBBBB" w:sz="4"/>
+              <w:right w:val="single" w:color="BBBBBB" w:sz="4"/>
+            </w:tcBorders>
+            <w:shd w:fill="EAF1F8" w:val="clear"/>
+            <w:tcMar>
+              <w:top w:type="dxa" w:w="60"/>
+              <w:left w:type="dxa" w:w="100"/>
+              <w:bottom w:type="dxa" w:w="60"/>
+              <w:right w:type="dxa" w:w="100"/>
+            </w:tcMar>
+          </w:tcPr>
+          <w:p>
+            <w:pPr>
+              <w:jc w:val="center"/>
+            </w:pPr>
+            <w:r>
+              <w:rPr>
+                <w:rFonts w:ascii="Microsoft YaHei" w:cs="Microsoft YaHei" w:eastAsia="Microsoft YaHei" w:hAnsi="Microsoft YaHei"/>
+                <w:b w:val="false"/>
+                <w:bCs w:val="false"/>
+                <w:sz w:val="18"/>
+                <w:szCs w:val="18"/>
+              </w:rPr>
+              <w:t xml:space="preserve">9.72</w:t>
+            </w:r>
+          </w:p>
+        </w:tc>
+        <w:tc>
+          <w:tcPr>
+            <w:tcW w:type="dxa" w:w="2000"/>
+            <w:tcBorders>
+              <w:top w:val="single" w:color="BBBBBB" w:sz="4"/>
+              <w:left w:val="single" w:color="BBBBBB" w:sz="4"/>
+              <w:bottom w:val="single" w:color="BBBBBB" w:sz="4"/>
+              <w:right w:val="single" w:color="BBBBBB" w:sz="4"/>
+            </w:tcBorders>
+            <w:shd w:fill="EAF1F8" w:val="clear"/>
+            <w:tcMar>
+              <w:top w:type="dxa" w:w="60"/>
+              <w:left w:type="dxa" w:w="100"/>
+              <w:bottom w:type="dxa" w:w="60"/>
+              <w:right w:type="dxa" w:w="100"/>
+            </w:tcMar>
+          </w:tcPr>
+          <w:p>
+            <w:pPr>
+              <w:jc w:val="center"/>
+            </w:pPr>
+            <w:r>
+              <w:rPr>
+                <w:rFonts w:ascii="Microsoft YaHei" w:cs="Microsoft YaHei" w:eastAsia="Microsoft YaHei" w:hAnsi="Microsoft YaHei"/>
+                <w:b w:val="false"/>
+                <w:bCs w:val="false"/>
+                <w:sz w:val="18"/>
+                <w:szCs w:val="18"/>
+              </w:rPr>
+              <w:t xml:space="preserve">102.8</w:t>
+            </w:r>
+          </w:p>
+        </w:tc>
+        <w:tc>
+          <w:tcPr>
+            <w:tcW w:type="dxa" w:w="2000"/>
+            <w:tcBorders>
+              <w:top w:val="single" w:color="BBBBBB" w:sz="4"/>
+              <w:left w:val="single" w:color="BBBBBB" w:sz="4"/>
+              <w:bottom w:val="single" w:color="BBBBBB" w:sz="4"/>
+              <w:right w:val="single" w:color="BBBBBB" w:sz="4"/>
+            </w:tcBorders>
+            <w:shd w:fill="EAF1F8" w:val="clear"/>
+            <w:tcMar>
+              <w:top w:type="dxa" w:w="60"/>
+              <w:left w:type="dxa" w:w="100"/>
+              <w:bottom w:type="dxa" w:w="60"/>
+              <w:right w:type="dxa" w:w="100"/>
+            </w:tcMar>
+          </w:tcPr>
+          <w:p>
+            <w:pPr>
+              <w:jc w:val="center"/>
+            </w:pPr>
+            <w:r>
+              <w:rPr>
+                <w:rFonts w:ascii="Microsoft YaHei" w:cs="Microsoft YaHei" w:eastAsia="Microsoft YaHei" w:hAnsi="Microsoft YaHei"/>
+                <w:b w:val="false"/>
+                <w:bCs w:val="false"/>
+                <w:sz w:val="18"/>
+                <w:szCs w:val="18"/>
+              </w:rPr>
+              <w:t xml:space="preserve">93,728</w:t>
+            </w:r>
+          </w:p>
+        </w:tc>
+      </w:tr>
+    </w:tbl>
+    <w:p>
+      <w:pPr>
+        <w:spacing w:after="60" w:before="120"/>
+      </w:pPr>
+      <w:r>
+        <w:rPr>
+          <w:rFonts w:ascii="Microsoft YaHei" w:cs="Microsoft YaHei" w:eastAsia="Microsoft YaHei" w:hAnsi="Microsoft YaHei"/>
+          <w:b/>
+          <w:bCs/>
+          <w:color w:val="2E74B5"/>
+          <w:sz w:val="21"/>
+          <w:szCs w:val="21"/>
+        </w:rPr>
+        <w:t xml:space="preserve">表 6  NodeBlock 瘦身 4KB→2KB 索引大小与召回</w:t>
+      </w:r>
+    </w:p>
+    <w:tbl>
+      <w:tblPr>
+        <w:tblW w:type="dxa" w:w="9026"/>
+        <w:tblBorders>
+          <w:top w:val="single" w:color="auto" w:sz="4"/>
+          <w:left w:val="single" w:color="auto" w:sz="4"/>
+          <w:bottom w:val="single" w:color="auto" w:sz="4"/>
+          <w:right w:val="single" w:color="auto" w:sz="4"/>
+          <w:insideH w:val="single" w:color="auto" w:sz="4"/>
+          <w:insideV w:val="single" w:color="auto" w:sz="4"/>
+        </w:tblBorders>
+      </w:tblPr>
+      <w:tblGrid>
+        <w:gridCol w:w="2526"/>
+        <w:gridCol w:w="2250"/>
+        <w:gridCol w:w="2250"/>
+        <w:gridCol w:w="2000"/>
+      </w:tblGrid>
+      <w:tr>
+        <w:trPr>
+          <w:tblHeader/>
+        </w:trPr>
+        <w:tc>
+          <w:tcPr>
+            <w:tcW w:type="dxa" w:w="2526"/>
+            <w:tcBorders>
+              <w:top w:val="single" w:color="BBBBBB" w:sz="4"/>
+              <w:left w:val="single" w:color="BBBBBB" w:sz="4"/>
+              <w:bottom w:val="single" w:color="BBBBBB" w:sz="4"/>
+              <w:right w:val="single" w:color="BBBBBB" w:sz="4"/>
+            </w:tcBorders>
+            <w:shd w:fill="2E74B5" w:val="clear"/>
+            <w:tcMar>
+              <w:top w:type="dxa" w:w="60"/>
+              <w:left w:type="dxa" w:w="100"/>
+              <w:bottom w:type="dxa" w:w="60"/>
+              <w:right w:type="dxa" w:w="100"/>
+            </w:tcMar>
+          </w:tcPr>
+          <w:p>
+            <w:pPr>
+              <w:jc w:val="center"/>
+            </w:pPr>
+            <w:r>
+              <w:rPr>
+                <w:rFonts w:ascii="Microsoft YaHei" w:cs="Microsoft YaHei" w:eastAsia="Microsoft YaHei" w:hAnsi="Microsoft YaHei"/>
+                <w:b/>
+                <w:bCs/>
+                <w:color w:val="FFFFFF"/>
+                <w:sz w:val="18"/>
+                <w:szCs w:val="18"/>
+              </w:rPr>
+              <w:t xml:space="preserve">数据集</w:t>
+            </w:r>
+          </w:p>
+        </w:tc>
+        <w:tc>
+          <w:tcPr>
+            <w:tcW w:type="dxa" w:w="2250"/>
+            <w:tcBorders>
+              <w:top w:val="single" w:color="BBBBBB" w:sz="4"/>
+              <w:left w:val="single" w:color="BBBBBB" w:sz="4"/>
+              <w:bottom w:val="single" w:color="BBBBBB" w:sz="4"/>
+              <w:right w:val="single" w:color="BBBBBB" w:sz="4"/>
+            </w:tcBorders>
+            <w:shd w:fill="2E74B5" w:val="clear"/>
+            <w:tcMar>
+              <w:top w:type="dxa" w:w="60"/>
+              <w:left w:type="dxa" w:w="100"/>
+              <w:bottom w:type="dxa" w:w="60"/>
+              <w:right w:type="dxa" w:w="100"/>
+            </w:tcMar>
+          </w:tcPr>
+          <w:p>
+            <w:pPr>
+              <w:jc w:val="center"/>
+            </w:pPr>
+            <w:r>
+              <w:rPr>
+                <w:rFonts w:ascii="Microsoft YaHei" w:cs="Microsoft YaHei" w:eastAsia="Microsoft YaHei" w:hAnsi="Microsoft YaHei"/>
+                <w:b/>
+                <w:bCs/>
+                <w:color w:val="FFFFFF"/>
+                <w:sz w:val="18"/>
+                <w:szCs w:val="18"/>
+              </w:rPr>
+              <w:t xml:space="preserve">4KB 索引</w:t>
+            </w:r>
+          </w:p>
+        </w:tc>
+        <w:tc>
+          <w:tcPr>
+            <w:tcW w:type="dxa" w:w="2250"/>
+            <w:tcBorders>
+              <w:top w:val="single" w:color="BBBBBB" w:sz="4"/>
+              <w:left w:val="single" w:color="BBBBBB" w:sz="4"/>
+              <w:bottom w:val="single" w:color="BBBBBB" w:sz="4"/>
+              <w:right w:val="single" w:color="BBBBBB" w:sz="4"/>
+            </w:tcBorders>
+            <w:shd w:fill="2E74B5" w:val="clear"/>
+            <w:tcMar>
+              <w:top w:type="dxa" w:w="60"/>
+              <w:left w:type="dxa" w:w="100"/>
+              <w:bottom w:type="dxa" w:w="60"/>
+              <w:right w:type="dxa" w:w="100"/>
+            </w:tcMar>
+          </w:tcPr>
+          <w:p>
+            <w:pPr>
+              <w:jc w:val="center"/>
+            </w:pPr>
+            <w:r>
+              <w:rPr>
+                <w:rFonts w:ascii="Microsoft YaHei" w:cs="Microsoft YaHei" w:eastAsia="Microsoft YaHei" w:hAnsi="Microsoft YaHei"/>
+                <w:b/>
+                <w:bCs/>
+                <w:color w:val="FFFFFF"/>
+                <w:sz w:val="18"/>
+                <w:szCs w:val="18"/>
+              </w:rPr>
+              <w:t xml:space="preserve">2KB 索引</w:t>
+            </w:r>
+          </w:p>
+        </w:tc>
+        <w:tc>
+          <w:tcPr>
+            <w:tcW w:type="dxa" w:w="2000"/>
+            <w:tcBorders>
+              <w:top w:val="single" w:color="BBBBBB" w:sz="4"/>
+              <w:left w:val="single" w:color="BBBBBB" w:sz="4"/>
+              <w:bottom w:val="single" w:color="BBBBBB" w:sz="4"/>
+              <w:right w:val="single" w:color="BBBBBB" w:sz="4"/>
+            </w:tcBorders>
+            <w:shd w:fill="2E74B5" w:val="clear"/>
+            <w:tcMar>
+              <w:top w:type="dxa" w:w="60"/>
+              <w:left w:type="dxa" w:w="100"/>
+              <w:bottom w:type="dxa" w:w="60"/>
+              <w:right w:type="dxa" w:w="100"/>
+            </w:tcMar>
+          </w:tcPr>
+          <w:p>
+            <w:pPr>
+              <w:jc w:val="center"/>
+            </w:pPr>
+            <w:r>
+              <w:rPr>
+                <w:rFonts w:ascii="Microsoft YaHei" w:cs="Microsoft YaHei" w:eastAsia="Microsoft YaHei" w:hAnsi="Microsoft YaHei"/>
+                <w:b/>
+                <w:bCs/>
+                <w:color w:val="FFFFFF"/>
+                <w:sz w:val="18"/>
+                <w:szCs w:val="18"/>
+              </w:rPr>
+              <w:t xml:space="preserve">recall(2KB)</w:t>
+            </w:r>
+          </w:p>
+        </w:tc>
+      </w:tr>
+      <w:tr>
+        <w:tc>
+          <w:tcPr>
+            <w:tcW w:type="dxa" w:w="2526"/>
+            <w:tcBorders>
+              <w:top w:val="single" w:color="BBBBBB" w:sz="4"/>
+              <w:left w:val="single" w:color="BBBBBB" w:sz="4"/>
+              <w:bottom w:val="single" w:color="BBBBBB" w:sz="4"/>
+              <w:right w:val="single" w:color="BBBBBB" w:sz="4"/>
+            </w:tcBorders>
+            <w:tcMar>
+              <w:top w:type="dxa" w:w="60"/>
+              <w:left w:type="dxa" w:w="100"/>
+              <w:bottom w:type="dxa" w:w="60"/>
+              <w:right w:type="dxa" w:w="100"/>
+            </w:tcMar>
+          </w:tcPr>
+          <w:p>
+            <w:pPr>
+              <w:jc w:val="left"/>
+            </w:pPr>
+            <w:r>
+              <w:rPr>
+                <w:rFonts w:ascii="Microsoft YaHei" w:cs="Microsoft YaHei" w:eastAsia="Microsoft YaHei" w:hAnsi="Microsoft YaHei"/>
+                <w:b w:val="false"/>
+                <w:bCs w:val="false"/>
+                <w:sz w:val="18"/>
+                <w:szCs w:val="18"/>
+              </w:rPr>
+              <w:t xml:space="preserve">SIFT 100K</w:t>
+            </w:r>
+          </w:p>
+        </w:tc>
+        <w:tc>
+          <w:tcPr>
+            <w:tcW w:type="dxa" w:w="2250"/>
+            <w:tcBorders>
+              <w:top w:val="single" w:color="BBBBBB" w:sz="4"/>
+              <w:left w:val="single" w:color="BBBBBB" w:sz="4"/>
+              <w:bottom w:val="single" w:color="BBBBBB" w:sz="4"/>
+              <w:right w:val="single" w:color="BBBBBB" w:sz="4"/>
+            </w:tcBorders>
+            <w:tcMar>
+              <w:top w:type="dxa" w:w="60"/>
+              <w:left w:type="dxa" w:w="100"/>
+              <w:bottom w:type="dxa" w:w="60"/>
+              <w:right w:type="dxa" w:w="100"/>
+            </w:tcMar>
+          </w:tcPr>
+          <w:p>
+            <w:pPr>
+              <w:jc w:val="center"/>
+            </w:pPr>
+            <w:r>
+              <w:rPr>
+                <w:rFonts w:ascii="Microsoft YaHei" w:cs="Microsoft YaHei" w:eastAsia="Microsoft YaHei" w:hAnsi="Microsoft YaHei"/>
+                <w:b w:val="false"/>
+                <w:bCs w:val="false"/>
+                <w:sz w:val="18"/>
+                <w:szCs w:val="18"/>
+              </w:rPr>
+              <w:t xml:space="preserve">391 MB</w:t>
+            </w:r>
+          </w:p>
+        </w:tc>
+        <w:tc>
+          <w:tcPr>
+            <w:tcW w:type="dxa" w:w="2250"/>
+            <w:tcBorders>
+              <w:top w:val="single" w:color="BBBBBB" w:sz="4"/>
+              <w:left w:val="single" w:color="BBBBBB" w:sz="4"/>
+              <w:bottom w:val="single" w:color="BBBBBB" w:sz="4"/>
+              <w:right w:val="single" w:color="BBBBBB" w:sz="4"/>
+            </w:tcBorders>
+            <w:tcMar>
+              <w:top w:type="dxa" w:w="60"/>
+              <w:left w:type="dxa" w:w="100"/>
+              <w:bottom w:type="dxa" w:w="60"/>
+              <w:right w:type="dxa" w:w="100"/>
+            </w:tcMar>
+          </w:tcPr>
+          <w:p>
+            <w:pPr>
+              <w:jc w:val="center"/>
+            </w:pPr>
+            <w:r>
+              <w:rPr>
+                <w:rFonts w:ascii="Microsoft YaHei" w:cs="Microsoft YaHei" w:eastAsia="Microsoft YaHei" w:hAnsi="Microsoft YaHei"/>
+                <w:b w:val="false"/>
+                <w:bCs w:val="false"/>
+                <w:sz w:val="18"/>
+                <w:szCs w:val="18"/>
+              </w:rPr>
+              <w:t xml:space="preserve">195 MB(减半)</w:t>
+            </w:r>
+          </w:p>
+        </w:tc>
+        <w:tc>
+          <w:tcPr>
+            <w:tcW w:type="dxa" w:w="2000"/>
+            <w:tcBorders>
+              <w:top w:val="single" w:color="BBBBBB" w:sz="4"/>
+              <w:left w:val="single" w:color="BBBBBB" w:sz="4"/>
+              <w:bottom w:val="single" w:color="BBBBBB" w:sz="4"/>
+              <w:right w:val="single" w:color="BBBBBB" w:sz="4"/>
+            </w:tcBorders>
+            <w:tcMar>
+              <w:top w:type="dxa" w:w="60"/>
+              <w:left w:type="dxa" w:w="100"/>
+              <w:bottom w:type="dxa" w:w="60"/>
+              <w:right w:type="dxa" w:w="100"/>
+            </w:tcMar>
+          </w:tcPr>
+          <w:p>
+            <w:pPr>
+              <w:jc w:val="center"/>
+            </w:pPr>
+            <w:r>
+              <w:rPr>
+                <w:rFonts w:ascii="Microsoft YaHei" w:cs="Microsoft YaHei" w:eastAsia="Microsoft YaHei" w:hAnsi="Microsoft YaHei"/>
+                <w:b w:val="false"/>
+                <w:bCs w:val="false"/>
+                <w:sz w:val="18"/>
+                <w:szCs w:val="18"/>
+              </w:rPr>
+              <w:t xml:space="preserve">1.000</w:t>
+            </w:r>
+          </w:p>
+        </w:tc>
+      </w:tr>
+      <w:tr>
+        <w:tc>
+          <w:tcPr>
+            <w:tcW w:type="dxa" w:w="2526"/>
+            <w:tcBorders>
+              <w:top w:val="single" w:color="BBBBBB" w:sz="4"/>
+              <w:left w:val="single" w:color="BBBBBB" w:sz="4"/>
+              <w:bottom w:val="single" w:color="BBBBBB" w:sz="4"/>
+              <w:right w:val="single" w:color="BBBBBB" w:sz="4"/>
+            </w:tcBorders>
+            <w:shd w:fill="EAF1F8" w:val="clear"/>
+            <w:tcMar>
+              <w:top w:type="dxa" w:w="60"/>
+              <w:left w:type="dxa" w:w="100"/>
+              <w:bottom w:type="dxa" w:w="60"/>
+              <w:right w:type="dxa" w:w="100"/>
+            </w:tcMar>
+          </w:tcPr>
+          <w:p>
+            <w:pPr>
+              <w:jc w:val="left"/>
+            </w:pPr>
+            <w:r>
+              <w:rPr>
+                <w:rFonts w:ascii="Microsoft YaHei" w:cs="Microsoft YaHei" w:eastAsia="Microsoft YaHei" w:hAnsi="Microsoft YaHei"/>
+                <w:b w:val="false"/>
+                <w:bCs w:val="false"/>
+                <w:sz w:val="18"/>
+                <w:szCs w:val="18"/>
+              </w:rPr>
+              <w:t xml:space="preserve">BigANN 1M</w:t>
+            </w:r>
+          </w:p>
+        </w:tc>
+        <w:tc>
+          <w:tcPr>
+            <w:tcW w:type="dxa" w:w="2250"/>
+            <w:tcBorders>
+              <w:top w:val="single" w:color="BBBBBB" w:sz="4"/>
+              <w:left w:val="single" w:color="BBBBBB" w:sz="4"/>
+              <w:bottom w:val="single" w:color="BBBBBB" w:sz="4"/>
+              <w:right w:val="single" w:color="BBBBBB" w:sz="4"/>
+            </w:tcBorders>
+            <w:shd w:fill="EAF1F8" w:val="clear"/>
+            <w:tcMar>
+              <w:top w:type="dxa" w:w="60"/>
+              <w:left w:type="dxa" w:w="100"/>
+              <w:bottom w:type="dxa" w:w="60"/>
+              <w:right w:type="dxa" w:w="100"/>
+            </w:tcMar>
+          </w:tcPr>
+          <w:p>
+            <w:pPr>
+              <w:jc w:val="center"/>
+            </w:pPr>
+            <w:r>
+              <w:rPr>
+                <w:rFonts w:ascii="Microsoft YaHei" w:cs="Microsoft YaHei" w:eastAsia="Microsoft YaHei" w:hAnsi="Microsoft YaHei"/>
+                <w:b w:val="false"/>
+                <w:bCs w:val="false"/>
+                <w:sz w:val="18"/>
+                <w:szCs w:val="18"/>
+              </w:rPr>
+              <w:t xml:space="preserve">3.9 GB</w:t>
+            </w:r>
+          </w:p>
+        </w:tc>
+        <w:tc>
+          <w:tcPr>
+            <w:tcW w:type="dxa" w:w="2250"/>
+            <w:tcBorders>
+              <w:top w:val="single" w:color="BBBBBB" w:sz="4"/>
+              <w:left w:val="single" w:color="BBBBBB" w:sz="4"/>
+              <w:bottom w:val="single" w:color="BBBBBB" w:sz="4"/>
+              <w:right w:val="single" w:color="BBBBBB" w:sz="4"/>
+            </w:tcBorders>
+            <w:shd w:fill="EAF1F8" w:val="clear"/>
+            <w:tcMar>
+              <w:top w:type="dxa" w:w="60"/>
+              <w:left w:type="dxa" w:w="100"/>
+              <w:bottom w:type="dxa" w:w="60"/>
+              <w:right w:type="dxa" w:w="100"/>
+            </w:tcMar>
+          </w:tcPr>
+          <w:p>
+            <w:pPr>
+              <w:jc w:val="center"/>
+            </w:pPr>
+            <w:r>
+              <w:rPr>
+                <w:rFonts w:ascii="Microsoft YaHei" w:cs="Microsoft YaHei" w:eastAsia="Microsoft YaHei" w:hAnsi="Microsoft YaHei"/>
+                <w:b w:val="false"/>
+                <w:bCs w:val="false"/>
+                <w:sz w:val="18"/>
+                <w:szCs w:val="18"/>
+              </w:rPr>
+              <w:t xml:space="preserve">2.0 GB(减半)</w:t>
+            </w:r>
+          </w:p>
+        </w:tc>
+        <w:tc>
+          <w:tcPr>
+            <w:tcW w:type="dxa" w:w="2000"/>
+            <w:tcBorders>
+              <w:top w:val="single" w:color="BBBBBB" w:sz="4"/>
+              <w:left w:val="single" w:color="BBBBBB" w:sz="4"/>
+              <w:bottom w:val="single" w:color="BBBBBB" w:sz="4"/>
+              <w:right w:val="single" w:color="BBBBBB" w:sz="4"/>
+            </w:tcBorders>
+            <w:shd w:fill="EAF1F8" w:val="clear"/>
+            <w:tcMar>
+              <w:top w:type="dxa" w:w="60"/>
+              <w:left w:type="dxa" w:w="100"/>
+              <w:bottom w:type="dxa" w:w="60"/>
+              <w:right w:type="dxa" w:w="100"/>
+            </w:tcMar>
+          </w:tcPr>
+          <w:p>
+            <w:pPr>
+              <w:jc w:val="center"/>
+            </w:pPr>
+            <w:r>
+              <w:rPr>
+                <w:rFonts w:ascii="Microsoft YaHei" w:cs="Microsoft YaHei" w:eastAsia="Microsoft YaHei" w:hAnsi="Microsoft YaHei"/>
+                <w:b w:val="false"/>
+                <w:bCs w:val="false"/>
+                <w:sz w:val="18"/>
+                <w:szCs w:val="18"/>
+              </w:rPr>
+              <w:t xml:space="preserve">0.991</w:t>
+            </w:r>
+          </w:p>
+        </w:tc>
+      </w:tr>
+    </w:tbl>
+    <w:p>
+      <w:pPr>
+        <w:spacing w:after="60" w:before="120"/>
+      </w:pPr>
+      <w:r>
+        <w:rPr>
+          <w:rFonts w:ascii="Microsoft YaHei" w:cs="Microsoft YaHei" w:eastAsia="Microsoft YaHei" w:hAnsi="Microsoft YaHei"/>
+          <w:b/>
+          <w:bCs/>
+          <w:color w:val="2E74B5"/>
+          <w:sz w:val="21"/>
+          <w:szCs w:val="21"/>
+        </w:rPr>
+        <w:t xml:space="preserve">表 7  BigANN 1M 受限内存(cgroup 2.5GB，瘦身 2KB 索引，recall 0.994)</w:t>
+      </w:r>
+    </w:p>
+    <w:tbl>
+      <w:tblPr>
+        <w:tblW w:type="dxa" w:w="9026"/>
+        <w:tblBorders>
+          <w:top w:val="single" w:color="auto" w:sz="4"/>
+          <w:left w:val="single" w:color="auto" w:sz="4"/>
+          <w:bottom w:val="single" w:color="auto" w:sz="4"/>
+          <w:right w:val="single" w:color="auto" w:sz="4"/>
+          <w:insideH w:val="single" w:color="auto" w:sz="4"/>
+          <w:insideV w:val="single" w:color="auto" w:sz="4"/>
+        </w:tblBorders>
+      </w:tblPr>
+      <w:tblGrid>
+        <w:gridCol w:w="2526"/>
+        <w:gridCol w:w="1300"/>
+        <w:gridCol w:w="1300"/>
+        <w:gridCol w:w="1100"/>
+        <w:gridCol w:w="1800"/>
+        <w:gridCol w:w="1000"/>
+      </w:tblGrid>
+      <w:tr>
+        <w:trPr>
+          <w:tblHeader/>
+        </w:trPr>
+        <w:tc>
+          <w:tcPr>
+            <w:tcW w:type="dxa" w:w="2526"/>
+            <w:tcBorders>
+              <w:top w:val="single" w:color="BBBBBB" w:sz="4"/>
+              <w:left w:val="single" w:color="BBBBBB" w:sz="4"/>
+              <w:bottom w:val="single" w:color="BBBBBB" w:sz="4"/>
+              <w:right w:val="single" w:color="BBBBBB" w:sz="4"/>
+            </w:tcBorders>
+            <w:shd w:fill="2E74B5" w:val="clear"/>
+            <w:tcMar>
+              <w:top w:type="dxa" w:w="60"/>
+              <w:left w:type="dxa" w:w="100"/>
+              <w:bottom w:type="dxa" w:w="60"/>
+              <w:right w:type="dxa" w:w="100"/>
+            </w:tcMar>
+          </w:tcPr>
+          <w:p>
+            <w:pPr>
+              <w:jc w:val="center"/>
+            </w:pPr>
+            <w:r>
+              <w:rPr>
+                <w:rFonts w:ascii="Microsoft YaHei" w:cs="Microsoft YaHei" w:eastAsia="Microsoft YaHei" w:hAnsi="Microsoft YaHei"/>
+                <w:b/>
+                <w:bCs/>
+                <w:color w:val="FFFFFF"/>
+                <w:sz w:val="18"/>
+                <w:szCs w:val="18"/>
+              </w:rPr>
+              <w:t xml:space="preserve">模式</w:t>
+            </w:r>
+          </w:p>
+        </w:tc>
+        <w:tc>
+          <w:tcPr>
+            <w:tcW w:type="dxa" w:w="1300"/>
+            <w:tcBorders>
+              <w:top w:val="single" w:color="BBBBBB" w:sz="4"/>
+              <w:left w:val="single" w:color="BBBBBB" w:sz="4"/>
+              <w:bottom w:val="single" w:color="BBBBBB" w:sz="4"/>
+              <w:right w:val="single" w:color="BBBBBB" w:sz="4"/>
+            </w:tcBorders>
+            <w:shd w:fill="2E74B5" w:val="clear"/>
+            <w:tcMar>
+              <w:top w:type="dxa" w:w="60"/>
+              <w:left w:type="dxa" w:w="100"/>
+              <w:bottom w:type="dxa" w:w="60"/>
+              <w:right w:type="dxa" w:w="100"/>
+            </w:tcMar>
+          </w:tcPr>
+          <w:p>
+            <w:pPr>
+              <w:jc w:val="center"/>
+            </w:pPr>
+            <w:r>
+              <w:rPr>
+                <w:rFonts w:ascii="Microsoft YaHei" w:cs="Microsoft YaHei" w:eastAsia="Microsoft YaHei" w:hAnsi="Microsoft YaHei"/>
+                <w:b/>
+                <w:bCs/>
+                <w:color w:val="FFFFFF"/>
+                <w:sz w:val="18"/>
+                <w:szCs w:val="18"/>
+              </w:rPr>
+              <w:t xml:space="preserve">avg(ms)</w:t>
+            </w:r>
+          </w:p>
+        </w:tc>
+        <w:tc>
+          <w:tcPr>
+            <w:tcW w:type="dxa" w:w="1300"/>
+            <w:tcBorders>
+              <w:top w:val="single" w:color="BBBBBB" w:sz="4"/>
+              <w:left w:val="single" w:color="BBBBBB" w:sz="4"/>
+              <w:bottom w:val="single" w:color="BBBBBB" w:sz="4"/>
+              <w:right w:val="single" w:color="BBBBBB" w:sz="4"/>
+            </w:tcBorders>
+            <w:shd w:fill="2E74B5" w:val="clear"/>
+            <w:tcMar>
+              <w:top w:type="dxa" w:w="60"/>
+              <w:left w:type="dxa" w:w="100"/>
+              <w:bottom w:type="dxa" w:w="60"/>
+              <w:right w:type="dxa" w:w="100"/>
+            </w:tcMar>
+          </w:tcPr>
+          <w:p>
+            <w:pPr>
+              <w:jc w:val="center"/>
+            </w:pPr>
+            <w:r>
+              <w:rPr>
+                <w:rFonts w:ascii="Microsoft YaHei" w:cs="Microsoft YaHei" w:eastAsia="Microsoft YaHei" w:hAnsi="Microsoft YaHei"/>
+                <w:b/>
+                <w:bCs/>
+                <w:color w:val="FFFFFF"/>
+                <w:sz w:val="18"/>
+                <w:szCs w:val="18"/>
+              </w:rPr>
+              <w:t xml:space="preserve">p99(ms)</w:t>
+            </w:r>
+          </w:p>
+        </w:tc>
+        <w:tc>
+          <w:tcPr>
+            <w:tcW w:type="dxa" w:w="1100"/>
+            <w:tcBorders>
+              <w:top w:val="single" w:color="BBBBBB" w:sz="4"/>
+              <w:left w:val="single" w:color="BBBBBB" w:sz="4"/>
+              <w:bottom w:val="single" w:color="BBBBBB" w:sz="4"/>
+              <w:right w:val="single" w:color="BBBBBB" w:sz="4"/>
+            </w:tcBorders>
+            <w:shd w:fill="2E74B5" w:val="clear"/>
+            <w:tcMar>
+              <w:top w:type="dxa" w:w="60"/>
+              <w:left w:type="dxa" w:w="100"/>
+              <w:bottom w:type="dxa" w:w="60"/>
+              <w:right w:type="dxa" w:w="100"/>
+            </w:tcMar>
+          </w:tcPr>
+          <w:p>
+            <w:pPr>
+              <w:jc w:val="center"/>
+            </w:pPr>
+            <w:r>
+              <w:rPr>
+                <w:rFonts w:ascii="Microsoft YaHei" w:cs="Microsoft YaHei" w:eastAsia="Microsoft YaHei" w:hAnsi="Microsoft YaHei"/>
+                <w:b/>
+                <w:bCs/>
+                <w:color w:val="FFFFFF"/>
+                <w:sz w:val="18"/>
+                <w:szCs w:val="18"/>
+              </w:rPr>
+              <w:t xml:space="preserve">QPS</w:t>
+            </w:r>
+          </w:p>
+        </w:tc>
+        <w:tc>
+          <w:tcPr>
+            <w:tcW w:type="dxa" w:w="1800"/>
+            <w:tcBorders>
+              <w:top w:val="single" w:color="BBBBBB" w:sz="4"/>
+              <w:left w:val="single" w:color="BBBBBB" w:sz="4"/>
+              <w:bottom w:val="single" w:color="BBBBBB" w:sz="4"/>
+              <w:right w:val="single" w:color="BBBBBB" w:sz="4"/>
+            </w:tcBorders>
+            <w:shd w:fill="2E74B5" w:val="clear"/>
+            <w:tcMar>
+              <w:top w:type="dxa" w:w="60"/>
+              <w:left w:type="dxa" w:w="100"/>
+              <w:bottom w:type="dxa" w:w="60"/>
+              <w:right w:type="dxa" w:w="100"/>
+            </w:tcMar>
+          </w:tcPr>
+          <w:p>
+            <w:pPr>
+              <w:jc w:val="center"/>
+            </w:pPr>
+            <w:r>
+              <w:rPr>
+                <w:rFonts w:ascii="Microsoft YaHei" w:cs="Microsoft YaHei" w:eastAsia="Microsoft YaHei" w:hAnsi="Microsoft YaHei"/>
+                <w:b/>
+                <w:bCs/>
+                <w:color w:val="FFFFFF"/>
+                <w:sz w:val="18"/>
+                <w:szCs w:val="18"/>
+              </w:rPr>
+              <w:t xml:space="preserve">磁盘块读</w:t>
+            </w:r>
+          </w:p>
+        </w:tc>
+        <w:tc>
+          <w:tcPr>
+            <w:tcW w:type="dxa" w:w="1000"/>
+            <w:tcBorders>
+              <w:top w:val="single" w:color="BBBBBB" w:sz="4"/>
+              <w:left w:val="single" w:color="BBBBBB" w:sz="4"/>
+              <w:bottom w:val="single" w:color="BBBBBB" w:sz="4"/>
+              <w:right w:val="single" w:color="BBBBBB" w:sz="4"/>
+            </w:tcBorders>
+            <w:shd w:fill="2E74B5" w:val="clear"/>
+            <w:tcMar>
+              <w:top w:type="dxa" w:w="60"/>
+              <w:left w:type="dxa" w:w="100"/>
+              <w:bottom w:type="dxa" w:w="60"/>
+              <w:right w:type="dxa" w:w="100"/>
+            </w:tcMar>
+          </w:tcPr>
+          <w:p>
+            <w:pPr>
+              <w:jc w:val="center"/>
+            </w:pPr>
+            <w:r>
+              <w:rPr>
+                <w:rFonts w:ascii="Microsoft YaHei" w:cs="Microsoft YaHei" w:eastAsia="Microsoft YaHei" w:hAnsi="Microsoft YaHei"/>
+                <w:b/>
+                <w:bCs/>
+                <w:color w:val="FFFFFF"/>
+                <w:sz w:val="18"/>
+                <w:szCs w:val="18"/>
+              </w:rPr>
+              <w:t xml:space="preserve">OOM?</w:t>
+            </w:r>
+          </w:p>
+        </w:tc>
+      </w:tr>
+      <w:tr>
+        <w:tc>
+          <w:tcPr>
+            <w:tcW w:type="dxa" w:w="2526"/>
+            <w:tcBorders>
+              <w:top w:val="single" w:color="BBBBBB" w:sz="4"/>
+              <w:left w:val="single" w:color="BBBBBB" w:sz="4"/>
+              <w:bottom w:val="single" w:color="BBBBBB" w:sz="4"/>
+              <w:right w:val="single" w:color="BBBBBB" w:sz="4"/>
+            </w:tcBorders>
+            <w:tcMar>
+              <w:top w:type="dxa" w:w="60"/>
+              <w:left w:type="dxa" w:w="100"/>
+              <w:bottom w:type="dxa" w:w="60"/>
+              <w:right w:type="dxa" w:w="100"/>
+            </w:tcMar>
+          </w:tcPr>
+          <w:p>
+            <w:pPr>
+              <w:jc w:val="left"/>
+            </w:pPr>
+            <w:r>
+              <w:rPr>
+                <w:rFonts w:ascii="Microsoft YaHei" w:cs="Microsoft YaHei" w:eastAsia="Microsoft YaHei" w:hAnsi="Microsoft YaHei"/>
+                <w:b w:val="false"/>
+                <w:bCs w:val="false"/>
+                <w:sz w:val="18"/>
+                <w:szCs w:val="18"/>
+              </w:rPr>
+              <w:t xml:space="preserve">slim2k builtin</w:t>
+            </w:r>
+          </w:p>
+        </w:tc>
+        <w:tc>
+          <w:tcPr>
+            <w:tcW w:type="dxa" w:w="1300"/>
+            <w:tcBorders>
+              <w:top w:val="single" w:color="BBBBBB" w:sz="4"/>
+              <w:left w:val="single" w:color="BBBBBB" w:sz="4"/>
+              <w:bottom w:val="single" w:color="BBBBBB" w:sz="4"/>
+              <w:right w:val="single" w:color="BBBBBB" w:sz="4"/>
+            </w:tcBorders>
+            <w:tcMar>
+              <w:top w:type="dxa" w:w="60"/>
+              <w:left w:type="dxa" w:w="100"/>
+              <w:bottom w:type="dxa" w:w="60"/>
+              <w:right w:type="dxa" w:w="100"/>
+            </w:tcMar>
+          </w:tcPr>
+          <w:p>
+            <w:pPr>
+              <w:jc w:val="center"/>
+            </w:pPr>
+            <w:r>
+              <w:rPr>
+                <w:rFonts w:ascii="Microsoft YaHei" w:cs="Microsoft YaHei" w:eastAsia="Microsoft YaHei" w:hAnsi="Microsoft YaHei"/>
+                <w:b w:val="false"/>
+                <w:bCs w:val="false"/>
+                <w:sz w:val="18"/>
+                <w:szCs w:val="18"/>
+              </w:rPr>
+              <w:t xml:space="preserve">19.1</w:t>
+            </w:r>
+          </w:p>
+        </w:tc>
+        <w:tc>
+          <w:tcPr>
+            <w:tcW w:type="dxa" w:w="1300"/>
+            <w:tcBorders>
+              <w:top w:val="single" w:color="BBBBBB" w:sz="4"/>
+              <w:left w:val="single" w:color="BBBBBB" w:sz="4"/>
+              <w:bottom w:val="single" w:color="BBBBBB" w:sz="4"/>
+              <w:right w:val="single" w:color="BBBBBB" w:sz="4"/>
+            </w:tcBorders>
+            <w:tcMar>
+              <w:top w:type="dxa" w:w="60"/>
+              <w:left w:type="dxa" w:w="100"/>
+              <w:bottom w:type="dxa" w:w="60"/>
+              <w:right w:type="dxa" w:w="100"/>
+            </w:tcMar>
+          </w:tcPr>
+          <w:p>
+            <w:pPr>
+              <w:jc w:val="center"/>
+            </w:pPr>
+            <w:r>
+              <w:rPr>
+                <w:rFonts w:ascii="Microsoft YaHei" w:cs="Microsoft YaHei" w:eastAsia="Microsoft YaHei" w:hAnsi="Microsoft YaHei"/>
+                <w:b w:val="false"/>
+                <w:bCs w:val="false"/>
+                <w:sz w:val="18"/>
+                <w:szCs w:val="18"/>
+              </w:rPr>
+              <w:t xml:space="preserve">29.3</w:t>
+            </w:r>
+          </w:p>
+        </w:tc>
+        <w:tc>
+          <w:tcPr>
+            <w:tcW w:type="dxa" w:w="1100"/>
+            <w:tcBorders>
+              <w:top w:val="single" w:color="BBBBBB" w:sz="4"/>
+              <w:left w:val="single" w:color="BBBBBB" w:sz="4"/>
+              <w:bottom w:val="single" w:color="BBBBBB" w:sz="4"/>
+              <w:right w:val="single" w:color="BBBBBB" w:sz="4"/>
+            </w:tcBorders>
+            <w:tcMar>
+              <w:top w:type="dxa" w:w="60"/>
+              <w:left w:type="dxa" w:w="100"/>
+              <w:bottom w:type="dxa" w:w="60"/>
+              <w:right w:type="dxa" w:w="100"/>
+            </w:tcMar>
+          </w:tcPr>
+          <w:p>
+            <w:pPr>
+              <w:jc w:val="center"/>
+            </w:pPr>
+            <w:r>
+              <w:rPr>
+                <w:rFonts w:ascii="Microsoft YaHei" w:cs="Microsoft YaHei" w:eastAsia="Microsoft YaHei" w:hAnsi="Microsoft YaHei"/>
+                <w:b w:val="false"/>
+                <w:bCs w:val="false"/>
+                <w:sz w:val="18"/>
+                <w:szCs w:val="18"/>
+              </w:rPr>
+              <w:t xml:space="preserve">52.4</w:t>
+            </w:r>
+          </w:p>
+        </w:tc>
+        <w:tc>
+          <w:tcPr>
+            <w:tcW w:type="dxa" w:w="1800"/>
+            <w:tcBorders>
+              <w:top w:val="single" w:color="BBBBBB" w:sz="4"/>
+              <w:left w:val="single" w:color="BBBBBB" w:sz="4"/>
+              <w:bottom w:val="single" w:color="BBBBBB" w:sz="4"/>
+              <w:right w:val="single" w:color="BBBBBB" w:sz="4"/>
+            </w:tcBorders>
+            <w:tcMar>
+              <w:top w:type="dxa" w:w="60"/>
+              <w:left w:type="dxa" w:w="100"/>
+              <w:bottom w:type="dxa" w:w="60"/>
+              <w:right w:type="dxa" w:w="100"/>
+            </w:tcMar>
+          </w:tcPr>
+          <w:p>
+            <w:pPr>
+              <w:jc w:val="center"/>
+            </w:pPr>
+            <w:r>
+              <w:rPr>
+                <w:rFonts w:ascii="Microsoft YaHei" w:cs="Microsoft YaHei" w:eastAsia="Microsoft YaHei" w:hAnsi="Microsoft YaHei"/>
+                <w:b w:val="false"/>
+                <w:bCs w:val="false"/>
+                <w:sz w:val="18"/>
+                <w:szCs w:val="18"/>
+              </w:rPr>
+              <w:t xml:space="preserve">107,979</w:t>
+            </w:r>
+          </w:p>
+        </w:tc>
+        <w:tc>
+          <w:tcPr>
+            <w:tcW w:type="dxa" w:w="1000"/>
+            <w:tcBorders>
+              <w:top w:val="single" w:color="BBBBBB" w:sz="4"/>
+              <w:left w:val="single" w:color="BBBBBB" w:sz="4"/>
+              <w:bottom w:val="single" w:color="BBBBBB" w:sz="4"/>
+              <w:right w:val="single" w:color="BBBBBB" w:sz="4"/>
+            </w:tcBorders>
+            <w:tcMar>
+              <w:top w:type="dxa" w:w="60"/>
+              <w:left w:type="dxa" w:w="100"/>
+              <w:bottom w:type="dxa" w:w="60"/>
+              <w:right w:type="dxa" w:w="100"/>
+            </w:tcMar>
+          </w:tcPr>
+          <w:p>
+            <w:pPr>
+              <w:jc w:val="center"/>
+            </w:pPr>
+            <w:r>
+              <w:rPr>
+                <w:rFonts w:ascii="Microsoft YaHei" w:cs="Microsoft YaHei" w:eastAsia="Microsoft YaHei" w:hAnsi="Microsoft YaHei"/>
+                <w:b w:val="false"/>
+                <w:bCs w:val="false"/>
+                <w:sz w:val="18"/>
+                <w:szCs w:val="18"/>
+              </w:rPr>
+              <w:t xml:space="preserve">否</w:t>
+            </w:r>
+          </w:p>
+        </w:tc>
+      </w:tr>
+      <w:tr>
+        <w:tc>
+          <w:tcPr>
+            <w:tcW w:type="dxa" w:w="2526"/>
+            <w:tcBorders>
+              <w:top w:val="single" w:color="BBBBBB" w:sz="4"/>
+              <w:left w:val="single" w:color="BBBBBB" w:sz="4"/>
+              <w:bottom w:val="single" w:color="BBBBBB" w:sz="4"/>
+              <w:right w:val="single" w:color="BBBBBB" w:sz="4"/>
+            </w:tcBorders>
+            <w:shd w:fill="EAF1F8" w:val="clear"/>
+            <w:tcMar>
+              <w:top w:type="dxa" w:w="60"/>
+              <w:left w:type="dxa" w:w="100"/>
+              <w:bottom w:type="dxa" w:w="60"/>
+              <w:right w:type="dxa" w:w="100"/>
+            </w:tcMar>
+          </w:tcPr>
+          <w:p>
+            <w:pPr>
+              <w:jc w:val="left"/>
+            </w:pPr>
+            <w:r>
+              <w:rPr>
+                <w:rFonts w:ascii="Microsoft YaHei" w:cs="Microsoft YaHei" w:eastAsia="Microsoft YaHei" w:hAnsi="Microsoft YaHei"/>
+                <w:b w:val="false"/>
+                <w:bCs w:val="false"/>
+                <w:sz w:val="18"/>
+                <w:szCs w:val="18"/>
+              </w:rPr>
+              <w:t xml:space="preserve">slim2k learned</w:t>
+            </w:r>
+          </w:p>
+        </w:tc>
+        <w:tc>
+          <w:tcPr>
+            <w:tcW w:type="dxa" w:w="1300"/>
+            <w:tcBorders>
+              <w:top w:val="single" w:color="BBBBBB" w:sz="4"/>
+              <w:left w:val="single" w:color="BBBBBB" w:sz="4"/>
+              <w:bottom w:val="single" w:color="BBBBBB" w:sz="4"/>
+              <w:right w:val="single" w:color="BBBBBB" w:sz="4"/>
+            </w:tcBorders>
+            <w:shd w:fill="EAF1F8" w:val="clear"/>
+            <w:tcMar>
+              <w:top w:type="dxa" w:w="60"/>
+              <w:left w:type="dxa" w:w="100"/>
+              <w:bottom w:type="dxa" w:w="60"/>
+              <w:right w:type="dxa" w:w="100"/>
+            </w:tcMar>
+          </w:tcPr>
+          <w:p>
+            <w:pPr>
+              <w:jc w:val="center"/>
+            </w:pPr>
+            <w:r>
+              <w:rPr>
+                <w:rFonts w:ascii="Microsoft YaHei" w:cs="Microsoft YaHei" w:eastAsia="Microsoft YaHei" w:hAnsi="Microsoft YaHei"/>
+                <w:b w:val="false"/>
+                <w:bCs w:val="false"/>
+                <w:sz w:val="18"/>
+                <w:szCs w:val="18"/>
+              </w:rPr>
+              <w:t xml:space="preserve">9.15</w:t>
+            </w:r>
+          </w:p>
+        </w:tc>
+        <w:tc>
+          <w:tcPr>
+            <w:tcW w:type="dxa" w:w="1300"/>
+            <w:tcBorders>
+              <w:top w:val="single" w:color="BBBBBB" w:sz="4"/>
+              <w:left w:val="single" w:color="BBBBBB" w:sz="4"/>
+              <w:bottom w:val="single" w:color="BBBBBB" w:sz="4"/>
+              <w:right w:val="single" w:color="BBBBBB" w:sz="4"/>
+            </w:tcBorders>
+            <w:shd w:fill="EAF1F8" w:val="clear"/>
+            <w:tcMar>
+              <w:top w:type="dxa" w:w="60"/>
+              <w:left w:type="dxa" w:w="100"/>
+              <w:bottom w:type="dxa" w:w="60"/>
+              <w:right w:type="dxa" w:w="100"/>
+            </w:tcMar>
+          </w:tcPr>
+          <w:p>
+            <w:pPr>
+              <w:jc w:val="center"/>
+            </w:pPr>
+            <w:r>
+              <w:rPr>
+                <w:rFonts w:ascii="Microsoft YaHei" w:cs="Microsoft YaHei" w:eastAsia="Microsoft YaHei" w:hAnsi="Microsoft YaHei"/>
+                <w:b w:val="false"/>
+                <w:bCs w:val="false"/>
+                <w:sz w:val="18"/>
+                <w:szCs w:val="18"/>
+              </w:rPr>
+              <w:t xml:space="preserve">13.6</w:t>
+            </w:r>
+          </w:p>
+        </w:tc>
+        <w:tc>
+          <w:tcPr>
+            <w:tcW w:type="dxa" w:w="1100"/>
+            <w:tcBorders>
+              <w:top w:val="single" w:color="BBBBBB" w:sz="4"/>
+              <w:left w:val="single" w:color="BBBBBB" w:sz="4"/>
+              <w:bottom w:val="single" w:color="BBBBBB" w:sz="4"/>
+              <w:right w:val="single" w:color="BBBBBB" w:sz="4"/>
+            </w:tcBorders>
+            <w:shd w:fill="EAF1F8" w:val="clear"/>
+            <w:tcMar>
+              <w:top w:type="dxa" w:w="60"/>
+              <w:left w:type="dxa" w:w="100"/>
+              <w:bottom w:type="dxa" w:w="60"/>
+              <w:right w:type="dxa" w:w="100"/>
+            </w:tcMar>
+          </w:tcPr>
+          <w:p>
+            <w:pPr>
+              <w:jc w:val="center"/>
+            </w:pPr>
+            <w:r>
+              <w:rPr>
+                <w:rFonts w:ascii="Microsoft YaHei" w:cs="Microsoft YaHei" w:eastAsia="Microsoft YaHei" w:hAnsi="Microsoft YaHei"/>
+                <w:b w:val="false"/>
+                <w:bCs w:val="false"/>
+                <w:sz w:val="18"/>
+                <w:szCs w:val="18"/>
+              </w:rPr>
+              <w:t xml:space="preserve">109</w:t>
+            </w:r>
+          </w:p>
+        </w:tc>
+        <w:tc>
+          <w:tcPr>
+            <w:tcW w:type="dxa" w:w="1800"/>
+            <w:tcBorders>
+              <w:top w:val="single" w:color="BBBBBB" w:sz="4"/>
+              <w:left w:val="single" w:color="BBBBBB" w:sz="4"/>
+              <w:bottom w:val="single" w:color="BBBBBB" w:sz="4"/>
+              <w:right w:val="single" w:color="BBBBBB" w:sz="4"/>
+            </w:tcBorders>
+            <w:shd w:fill="EAF1F8" w:val="clear"/>
+            <w:tcMar>
+              <w:top w:type="dxa" w:w="60"/>
+              <w:left w:type="dxa" w:w="100"/>
+              <w:bottom w:type="dxa" w:w="60"/>
+              <w:right w:type="dxa" w:w="100"/>
+            </w:tcMar>
+          </w:tcPr>
+          <w:p>
+            <w:pPr>
+              <w:jc w:val="center"/>
+            </w:pPr>
+            <w:r>
+              <w:rPr>
+                <w:rFonts w:ascii="Microsoft YaHei" w:cs="Microsoft YaHei" w:eastAsia="Microsoft YaHei" w:hAnsi="Microsoft YaHei"/>
+                <w:b w:val="false"/>
+                <w:bCs w:val="false"/>
+                <w:sz w:val="18"/>
+                <w:szCs w:val="18"/>
+              </w:rPr>
+              <w:t xml:space="preserve">123,333</w:t>
+            </w:r>
+          </w:p>
+        </w:tc>
+        <w:tc>
+          <w:tcPr>
+            <w:tcW w:type="dxa" w:w="1000"/>
+            <w:tcBorders>
+              <w:top w:val="single" w:color="BBBBBB" w:sz="4"/>
+              <w:left w:val="single" w:color="BBBBBB" w:sz="4"/>
+              <w:bottom w:val="single" w:color="BBBBBB" w:sz="4"/>
+              <w:right w:val="single" w:color="BBBBBB" w:sz="4"/>
+            </w:tcBorders>
+            <w:shd w:fill="EAF1F8" w:val="clear"/>
+            <w:tcMar>
+              <w:top w:type="dxa" w:w="60"/>
+              <w:left w:type="dxa" w:w="100"/>
+              <w:bottom w:type="dxa" w:w="60"/>
+              <w:right w:type="dxa" w:w="100"/>
+            </w:tcMar>
+          </w:tcPr>
+          <w:p>
+            <w:pPr>
+              <w:jc w:val="center"/>
+            </w:pPr>
+            <w:r>
+              <w:rPr>
+                <w:rFonts w:ascii="Microsoft YaHei" w:cs="Microsoft YaHei" w:eastAsia="Microsoft YaHei" w:hAnsi="Microsoft YaHei"/>
+                <w:b w:val="false"/>
+                <w:bCs w:val="false"/>
+                <w:sz w:val="18"/>
+                <w:szCs w:val="18"/>
+              </w:rPr>
+              <w:t xml:space="preserve">否</w:t>
+            </w:r>
+          </w:p>
+        </w:tc>
+      </w:tr>
+    </w:tbl>
+    <w:p>
+      <w:pPr>
+        <w:spacing w:after="120" w:line="276"/>
+      </w:pPr>
+      <w:r>
+        <w:rPr>
+          <w:rFonts w:ascii="Microsoft YaHei" w:cs="Microsoft YaHei" w:eastAsia="Microsoft YaHei" w:hAnsi="Microsoft YaHei"/>
+          <w:i/>
+          <w:iCs/>
+          <w:sz w:val="19"/>
+          <w:szCs w:val="19"/>
+        </w:rPr>
+        <w:t xml:space="preserve">对照：同任务 4KB(3.9GB)索引在 3GB cap 下 baseline1/builtin 均 OOM、learned 才存活 81ms。瘦身把索引降到 2GB → 受限内存下不再 OOM、learned 延迟 81ms→9.15ms。</w:t>
+      </w:r>
+    </w:p>
+    <w:p>
+      <w:pPr>
+        <w:spacing w:after="60" w:before="120"/>
+      </w:pPr>
+      <w:r>
+        <w:rPr>
+          <w:rFonts w:ascii="Microsoft YaHei" w:cs="Microsoft YaHei" w:eastAsia="Microsoft YaHei" w:hAnsi="Microsoft YaHei"/>
+          <w:b/>
+          <w:bCs/>
+          <w:color w:val="2E74B5"/>
+          <w:sz w:val="21"/>
+          <w:szCs w:val="21"/>
+        </w:rPr>
+        <w:t xml:space="preserve">表 8  BigANN 1M 满内存四模式(128维，ef=128，recall 全 0.991)——Linux 原生 vs 本引擎</w:t>
       </w:r>
     </w:p>
     <w:tbl>
@@ -2815,7 +4973,7 @@
                 <w:sz w:val="18"/>
                 <w:szCs w:val="18"/>
               </w:rPr>
-              <w:t xml:space="preserve">磁盘块读数</w:t>
+              <w:t xml:space="preserve">磁盘块读</w:t>
             </w:r>
           </w:p>
         </w:tc>
@@ -2881,7 +5039,7 @@
                 <w:sz w:val="18"/>
                 <w:szCs w:val="18"/>
               </w:rPr>
-              <w:t xml:space="preserve">116.9</w:t>
+              <w:t xml:space="preserve">116.9*</w:t>
             </w:r>
           </w:p>
         </w:tc>
@@ -3741,310 +5899,19 @@
     </w:tbl>
     <w:p>
       <w:pPr>
-        <w:spacing w:after="60" w:before="120"/>
+        <w:spacing w:after="120" w:line="276"/>
       </w:pPr>
       <w:r>
         <w:rPr>
           <w:rFonts w:ascii="Microsoft YaHei" w:cs="Microsoft YaHei" w:eastAsia="Microsoft YaHei" w:hAnsi="Microsoft YaHei"/>
-          <w:b/>
-          <w:bCs/>
-          <w:color w:val="2E74B5"/>
-          <w:sz w:val="21"/>
-          <w:szCs w:val="21"/>
-        </w:rPr>
-        <w:t xml:space="preserve">表 5  BigANN 1M 受限内存（cgroup 3GB，索引 3.9GB，数据 &gt; 内存 → 真磁盘 I/O）</w:t>
-      </w:r>
-    </w:p>
-    <w:tbl>
-      <w:tblPr>
-        <w:tblW w:type="dxa" w:w="9026"/>
-        <w:tblBorders>
-          <w:top w:val="single" w:color="auto" w:sz="4"/>
-          <w:left w:val="single" w:color="auto" w:sz="4"/>
-          <w:bottom w:val="single" w:color="auto" w:sz="4"/>
-          <w:right w:val="single" w:color="auto" w:sz="4"/>
-          <w:insideH w:val="single" w:color="auto" w:sz="4"/>
-          <w:insideV w:val="single" w:color="auto" w:sz="4"/>
-        </w:tblBorders>
-      </w:tblPr>
-      <w:tblGrid>
-        <w:gridCol w:w="2426"/>
-        <w:gridCol w:w="6600"/>
-      </w:tblGrid>
-      <w:tr>
-        <w:trPr>
-          <w:tblHeader/>
-        </w:trPr>
-        <w:tc>
-          <w:tcPr>
-            <w:tcW w:type="dxa" w:w="2426"/>
-            <w:tcBorders>
-              <w:top w:val="single" w:color="BBBBBB" w:sz="4"/>
-              <w:left w:val="single" w:color="BBBBBB" w:sz="4"/>
-              <w:bottom w:val="single" w:color="BBBBBB" w:sz="4"/>
-              <w:right w:val="single" w:color="BBBBBB" w:sz="4"/>
-            </w:tcBorders>
-            <w:shd w:fill="2E74B5" w:val="clear"/>
-            <w:tcMar>
-              <w:top w:type="dxa" w:w="60"/>
-              <w:left w:type="dxa" w:w="100"/>
-              <w:bottom w:type="dxa" w:w="60"/>
-              <w:right w:type="dxa" w:w="100"/>
-            </w:tcMar>
-          </w:tcPr>
-          <w:p>
-            <w:pPr>
-              <w:jc w:val="center"/>
-            </w:pPr>
-            <w:r>
-              <w:rPr>
-                <w:rFonts w:ascii="Microsoft YaHei" w:cs="Microsoft YaHei" w:eastAsia="Microsoft YaHei" w:hAnsi="Microsoft YaHei"/>
-                <w:b/>
-                <w:bCs/>
-                <w:color w:val="FFFFFF"/>
-                <w:sz w:val="18"/>
-                <w:szCs w:val="18"/>
-              </w:rPr>
-              <w:t xml:space="preserve">模式</w:t>
-            </w:r>
-          </w:p>
-        </w:tc>
-        <w:tc>
-          <w:tcPr>
-            <w:tcW w:type="dxa" w:w="6600"/>
-            <w:tcBorders>
-              <w:top w:val="single" w:color="BBBBBB" w:sz="4"/>
-              <w:left w:val="single" w:color="BBBBBB" w:sz="4"/>
-              <w:bottom w:val="single" w:color="BBBBBB" w:sz="4"/>
-              <w:right w:val="single" w:color="BBBBBB" w:sz="4"/>
-            </w:tcBorders>
-            <w:shd w:fill="2E74B5" w:val="clear"/>
-            <w:tcMar>
-              <w:top w:type="dxa" w:w="60"/>
-              <w:left w:type="dxa" w:w="100"/>
-              <w:bottom w:type="dxa" w:w="60"/>
-              <w:right w:type="dxa" w:w="100"/>
-            </w:tcMar>
-          </w:tcPr>
-          <w:p>
-            <w:pPr>
-              <w:jc w:val="center"/>
-            </w:pPr>
-            <w:r>
-              <w:rPr>
-                <w:rFonts w:ascii="Microsoft YaHei" w:cs="Microsoft YaHei" w:eastAsia="Microsoft YaHei" w:hAnsi="Microsoft YaHei"/>
-                <w:b/>
-                <w:bCs/>
-                <w:color w:val="FFFFFF"/>
-                <w:sz w:val="18"/>
-                <w:szCs w:val="18"/>
-              </w:rPr>
-              <w:t xml:space="preserve">结果</w:t>
-            </w:r>
-          </w:p>
-        </w:tc>
-      </w:tr>
-      <w:tr>
-        <w:tc>
-          <w:tcPr>
-            <w:tcW w:type="dxa" w:w="2426"/>
-            <w:tcBorders>
-              <w:top w:val="single" w:color="BBBBBB" w:sz="4"/>
-              <w:left w:val="single" w:color="BBBBBB" w:sz="4"/>
-              <w:bottom w:val="single" w:color="BBBBBB" w:sz="4"/>
-              <w:right w:val="single" w:color="BBBBBB" w:sz="4"/>
-            </w:tcBorders>
-            <w:tcMar>
-              <w:top w:type="dxa" w:w="60"/>
-              <w:left w:type="dxa" w:w="100"/>
-              <w:bottom w:type="dxa" w:w="60"/>
-              <w:right w:type="dxa" w:w="100"/>
-            </w:tcMar>
-          </w:tcPr>
-          <w:p>
-            <w:pPr>
-              <w:jc w:val="left"/>
-            </w:pPr>
-            <w:r>
-              <w:rPr>
-                <w:rFonts w:ascii="Microsoft YaHei" w:cs="Microsoft YaHei" w:eastAsia="Microsoft YaHei" w:hAnsi="Microsoft YaHei"/>
-                <w:b w:val="false"/>
-                <w:bCs w:val="false"/>
-                <w:sz w:val="18"/>
-                <w:szCs w:val="18"/>
-              </w:rPr>
-              <w:t xml:space="preserve">Linux原生 baseline1</w:t>
-            </w:r>
-          </w:p>
-        </w:tc>
-        <w:tc>
-          <w:tcPr>
-            <w:tcW w:type="dxa" w:w="6600"/>
-            <w:tcBorders>
-              <w:top w:val="single" w:color="BBBBBB" w:sz="4"/>
-              <w:left w:val="single" w:color="BBBBBB" w:sz="4"/>
-              <w:bottom w:val="single" w:color="BBBBBB" w:sz="4"/>
-              <w:right w:val="single" w:color="BBBBBB" w:sz="4"/>
-            </w:tcBorders>
-            <w:tcMar>
-              <w:top w:type="dxa" w:w="60"/>
-              <w:left w:type="dxa" w:w="100"/>
-              <w:bottom w:type="dxa" w:w="60"/>
-              <w:right w:type="dxa" w:w="100"/>
-            </w:tcMar>
-          </w:tcPr>
-          <w:p>
-            <w:pPr>
-              <w:jc w:val="left"/>
-            </w:pPr>
-            <w:r>
-              <w:rPr>
-                <w:rFonts w:ascii="Microsoft YaHei" w:cs="Microsoft YaHei" w:eastAsia="Microsoft YaHei" w:hAnsi="Microsoft YaHei"/>
-                <w:b w:val="false"/>
-                <w:bCs w:val="false"/>
-                <w:sz w:val="18"/>
-                <w:szCs w:val="18"/>
-              </w:rPr>
-              <w:t xml:space="preserve">被 OOM 杀死（约 40s）—— 无应用缓存，疯狂 pread 整库，页缓存涨速超过内核回收，memcg 触顶被杀</w:t>
-            </w:r>
-          </w:p>
-        </w:tc>
-      </w:tr>
-      <w:tr>
-        <w:tc>
-          <w:tcPr>
-            <w:tcW w:type="dxa" w:w="2426"/>
-            <w:tcBorders>
-              <w:top w:val="single" w:color="BBBBBB" w:sz="4"/>
-              <w:left w:val="single" w:color="BBBBBB" w:sz="4"/>
-              <w:bottom w:val="single" w:color="BBBBBB" w:sz="4"/>
-              <w:right w:val="single" w:color="BBBBBB" w:sz="4"/>
-            </w:tcBorders>
-            <w:shd w:fill="EAF1F8" w:val="clear"/>
-            <w:tcMar>
-              <w:top w:type="dxa" w:w="60"/>
-              <w:left w:type="dxa" w:w="100"/>
-              <w:bottom w:type="dxa" w:w="60"/>
-              <w:right w:type="dxa" w:w="100"/>
-            </w:tcMar>
-          </w:tcPr>
-          <w:p>
-            <w:pPr>
-              <w:jc w:val="left"/>
-            </w:pPr>
-            <w:r>
-              <w:rPr>
-                <w:rFonts w:ascii="Microsoft YaHei" w:cs="Microsoft YaHei" w:eastAsia="Microsoft YaHei" w:hAnsi="Microsoft YaHei"/>
-                <w:b w:val="false"/>
-                <w:bCs w:val="false"/>
-                <w:sz w:val="18"/>
-                <w:szCs w:val="18"/>
-              </w:rPr>
-              <w:t xml:space="preserve">本引擎 full+builtin</w:t>
-            </w:r>
-          </w:p>
-        </w:tc>
-        <w:tc>
-          <w:tcPr>
-            <w:tcW w:type="dxa" w:w="6600"/>
-            <w:tcBorders>
-              <w:top w:val="single" w:color="BBBBBB" w:sz="4"/>
-              <w:left w:val="single" w:color="BBBBBB" w:sz="4"/>
-              <w:bottom w:val="single" w:color="BBBBBB" w:sz="4"/>
-              <w:right w:val="single" w:color="BBBBBB" w:sz="4"/>
-            </w:tcBorders>
-            <w:shd w:fill="EAF1F8" w:val="clear"/>
-            <w:tcMar>
-              <w:top w:type="dxa" w:w="60"/>
-              <w:left w:type="dxa" w:w="100"/>
-              <w:bottom w:type="dxa" w:w="60"/>
-              <w:right w:type="dxa" w:w="100"/>
-            </w:tcMar>
-          </w:tcPr>
-          <w:p>
-            <w:pPr>
-              <w:jc w:val="left"/>
-            </w:pPr>
-            <w:r>
-              <w:rPr>
-                <w:rFonts w:ascii="Microsoft YaHei" w:cs="Microsoft YaHei" w:eastAsia="Microsoft YaHei" w:hAnsi="Microsoft YaHei"/>
-                <w:b w:val="false"/>
-                <w:bCs w:val="false"/>
-                <w:sz w:val="18"/>
-                <w:szCs w:val="18"/>
-              </w:rPr>
-              <w:t xml:space="preserve">被 OOM 杀死（约 44s）—— 分区推导的缓存池过大（1.4GB 动态 + 409MB pin）</w:t>
-            </w:r>
-          </w:p>
-        </w:tc>
-      </w:tr>
-      <w:tr>
-        <w:tc>
-          <w:tcPr>
-            <w:tcW w:type="dxa" w:w="2426"/>
-            <w:tcBorders>
-              <w:top w:val="single" w:color="BBBBBB" w:sz="4"/>
-              <w:left w:val="single" w:color="BBBBBB" w:sz="4"/>
-              <w:bottom w:val="single" w:color="BBBBBB" w:sz="4"/>
-              <w:right w:val="single" w:color="BBBBBB" w:sz="4"/>
-            </w:tcBorders>
-            <w:tcMar>
-              <w:top w:type="dxa" w:w="60"/>
-              <w:left w:type="dxa" w:w="100"/>
-              <w:bottom w:type="dxa" w:w="60"/>
-              <w:right w:type="dxa" w:w="100"/>
-            </w:tcMar>
-          </w:tcPr>
-          <w:p>
-            <w:pPr>
-              <w:jc w:val="left"/>
-            </w:pPr>
-            <w:r>
-              <w:rPr>
-                <w:rFonts w:ascii="Microsoft YaHei" w:cs="Microsoft YaHei" w:eastAsia="Microsoft YaHei" w:hAnsi="Microsoft YaHei"/>
-                <w:b w:val="false"/>
-                <w:bCs w:val="false"/>
-                <w:sz w:val="18"/>
-                <w:szCs w:val="18"/>
-              </w:rPr>
-              <w:t xml:space="preserve">本引擎 full+learned</w:t>
-            </w:r>
-          </w:p>
-        </w:tc>
-        <w:tc>
-          <w:tcPr>
-            <w:tcW w:type="dxa" w:w="6600"/>
-            <w:tcBorders>
-              <w:top w:val="single" w:color="BBBBBB" w:sz="4"/>
-              <w:left w:val="single" w:color="BBBBBB" w:sz="4"/>
-              <w:bottom w:val="single" w:color="BBBBBB" w:sz="4"/>
-              <w:right w:val="single" w:color="BBBBBB" w:sz="4"/>
-            </w:tcBorders>
-            <w:tcMar>
-              <w:top w:type="dxa" w:w="60"/>
-              <w:left w:type="dxa" w:w="100"/>
-              <w:bottom w:type="dxa" w:w="60"/>
-              <w:right w:type="dxa" w:w="100"/>
-            </w:tcMar>
-          </w:tcPr>
-          <w:p>
-            <w:pPr>
-              <w:jc w:val="left"/>
-            </w:pPr>
-            <w:r>
-              <w:rPr>
-                <w:rFonts w:ascii="Microsoft YaHei" w:cs="Microsoft YaHei" w:eastAsia="Microsoft YaHei" w:hAnsi="Microsoft YaHei"/>
-                <w:b w:val="false"/>
-                <w:bCs w:val="false"/>
-                <w:sz w:val="18"/>
-                <w:szCs w:val="18"/>
-              </w:rPr>
-              <w:t xml:space="preserve">存活：avg 81.4ms，p99 120.7ms，QPS 12.3，recall 0.994，读 112,389 块</w:t>
-            </w:r>
-          </w:p>
-        </w:tc>
-      </w:tr>
-    </w:tbl>
+          <w:i/>
+          <w:iCs/>
+          <w:sz w:val="19"/>
+          <w:szCs w:val="19"/>
+        </w:rPr>
+        <w:t xml:space="preserve">*baseline1 的 116.9ms 含首跑冷缓存成分(见 §3.7)；其磁盘块读与 baseline2 相同。本引擎将磁盘块读砍半(208K→102K)。</w:t>
+      </w:r>
+    </w:p>
     <w:p>
       <w:r>
         <w:br w:type="page"/>
@@ -4058,7 +5925,7 @@
         <w:rPr>
           <w:rFonts w:ascii="Microsoft YaHei" w:cs="Microsoft YaHei" w:eastAsia="Microsoft YaHei" w:hAnsi="Microsoft YaHei"/>
         </w:rPr>
-        <w:t xml:space="preserve">5  分析：各部分优势与成因</w:t>
+        <w:t xml:space="preserve">5  分析</w:t>
       </w:r>
     </w:p>
     <w:p>
@@ -4069,7 +5936,7 @@
         <w:rPr>
           <w:rFonts w:ascii="Microsoft YaHei" w:cs="Microsoft YaHei" w:eastAsia="Microsoft YaHei" w:hAnsi="Microsoft YaHei"/>
         </w:rPr>
-        <w:t xml:space="preserve">5.1  缓存 + 静态 pin → 磁盘块读数砍半（核心 I/O 优势）</w:t>
+        <w:t xml:space="preserve">5.1  缓存+静态 pin → 磁盘块读砍半(核心 I/O 优势)</w:t>
       </w:r>
     </w:p>
     <w:p>
@@ -4082,7 +5949,7 @@
           <w:sz w:val="21"/>
           <w:szCs w:val="21"/>
         </w:rPr>
-        <w:t xml:space="preserve">BigANN 1M 上，Linux 原生 208,466 块 → 本引擎 builtin 101,855 块（−51%）。成因：GraphAwareCache 的热点 LRU 加上 409MB 静态子图 pin（锚定 104,704 个导航枢纽节点），每条 query 反复经过的上层枢纽常驻应用内存，不再重复读盘。这是优化最硬的收益。</w:t>
+        <w:t xml:space="preserve">BigANN 1M：Linux 原生 208,466 块 → 本引擎 101,855(−51%)。成因：热点 LRU + 409MB 静态 pin(锚定 104,704 个导航枢纽)，每条 query 反复经过的枢纽常驻内存不再读盘。</w:t>
       </w:r>
     </w:p>
     <w:p>
@@ -4093,7 +5960,7 @@
         <w:rPr>
           <w:rFonts w:ascii="Microsoft YaHei" w:cs="Microsoft YaHei" w:eastAsia="Microsoft YaHei" w:hAnsi="Microsoft YaHei"/>
         </w:rPr>
-        <w:t xml:space="preserve">5.2  满内存下“读得少 ≠ 更快”（诚实的关键）</w:t>
+        <w:t xml:space="preserve">5.2  满内存下"读得少≠更快"，受限内存才回本</w:t>
       </w:r>
     </w:p>
     <w:p>
@@ -4106,7 +5973,7 @@
           <w:sz w:val="21"/>
           <w:szCs w:val="21"/>
         </w:rPr>
-        <w:t xml:space="preserve">满内存时整库都在 OS 页缓存，每次“块读”其实是微秒级的页缓存 pread。砍半读数省的是本就便宜的操作，而本引擎额外付出缓存哈希查找、驱逐索引的增删、预取邻居枚举、pin 判定等记账开销，反而使 builtin 平均延迟（33.2ms）略高于裸检索 baseline2（26.8ms）。注意 builtin 的 p50=19.2ms 优于 baseline2，但 p95/p99 更差，呈双峰：命中快、未命中与换入换出拖尾。结论：数据全进内存时，OS 页缓存已足够，应用缓存部分冗余，优化只在真碰盘时回本。</w:t>
+        <w:t xml:space="preserve">满内存时整库在页缓存，块读是微秒级，砍半省的有限而记账有成本，故满内存下本引擎不一定更快。优化的真实价值在"数据&gt;内存、真读盘"：此时 4KB 索引塞不下→OOM/抖动，瘦身后 2KB 索引装得下→learned 9.15ms 且不 OOM(对照 4KB 81ms + 多模式 OOM)。</w:t>
       </w:r>
     </w:p>
     <w:p>
@@ -4117,7 +5984,7 @@
         <w:rPr>
           <w:rFonts w:ascii="Microsoft YaHei" w:cs="Microsoft YaHei" w:eastAsia="Microsoft YaHei" w:hAnsi="Microsoft YaHei"/>
         </w:rPr>
-        <w:t xml:space="preserve">5.3  受限内存：优化真正发光，原生模式崩溃</w:t>
+        <w:t xml:space="preserve">5.3  瘦身为何是受限内存场景的关键</w:t>
       </w:r>
     </w:p>
     <w:p>
@@ -4130,7 +5997,7 @@
           <w:sz w:val="21"/>
           <w:szCs w:val="21"/>
         </w:rPr>
-        <w:t xml:space="preserve">当索引塞不进内存、真读盘时，Linux 原生 baseline1 直接被 OOM 杀死；本引擎的学习策略存活并稳定服务（81ms，recall 0.994）。成因：学习策略的准入控制（第二次未命中才进缓存，hot_insert_min_prior_misses=2）过滤掉一次性访问节点，使缓存内存占用小到能塞进内存，同时仍 pin 住枢纽。这正是“内存受限下能跑 vs 跑不动”的分水岭——经典策略缓存池过大也被 OOM，反向印证了准入控制的价值。</w:t>
+        <w:t xml:space="preserve">索引减半→内存装得下→磁盘读骤降、避免 OOM；单块 I/O 减半、同内存缓存翻倍；offset 为 node_id 纯函数，删除零召回损失(SIFT/BigANN recall 均不变)。</w:t>
       </w:r>
     </w:p>
     <w:p>
@@ -4141,7 +6008,7 @@
         <w:rPr>
           <w:rFonts w:ascii="Microsoft YaHei" w:cs="Microsoft YaHei" w:eastAsia="Microsoft YaHei" w:hAnsi="Microsoft YaHei"/>
         </w:rPr>
-        <w:t xml:space="preserve">5.4  baseline1 异常慢（116.9ms）= 写链路框架的空转开销</w:t>
+        <w:t xml:space="preserve">5.4  learned 策略在受限内存下持续占优</w:t>
       </w:r>
     </w:p>
     <w:p>
@@ -4154,7 +6021,7 @@
           <w:sz w:val="21"/>
           <w:szCs w:val="21"/>
         </w:rPr>
-        <w:t xml:space="preserve">baseline1 与 baseline2 唯一差别是前者保留了 WAL/Compaction/MemTable 写框架。两者读数、召回相同，baseline1 却慢 4.4×（116.9 vs 26.8ms）。成因：写框架（尤其每条 query 仍做 MemTable 暴力搜索 + 合并）即使空载也消耗约 90ms/query。这是写链路集成的一个真实低效点，值得单独优化。</w:t>
+        <w:t xml:space="preserve">受限内存下 learned(9.15ms)优于 builtin(19.1ms)，因其准入控制(第二次未命中才入缓存)过滤一次性访问、压低内存占用，是"装得下且更快"的关键。</w:t>
       </w:r>
     </w:p>
     <w:p>
@@ -4183,7 +6050,7 @@
           <w:sz w:val="21"/>
           <w:szCs w:val="21"/>
         </w:rPr>
-        <w:t xml:space="preserve">io_uring 在评测机为 noop：四组的预取利用率与提交块数均为 0，异步预取的收益本实验未体现；本引擎优势来自缓存 + 静态 pin + 准入策略，而非预取。</w:t>
+        <w:t xml:space="preserve">io_uring 评测机为 noop：预取利用率/提交块数全 0，异步预取收益未体现；本引擎优势来自缓存+pin+准入。</w:t>
       </w:r>
     </w:p>
     <w:p>
@@ -4201,7 +6068,7 @@
           <w:sz w:val="21"/>
           <w:szCs w:val="21"/>
         </w:rPr>
-        <w:t xml:space="preserve">满内存下应用缓存与 OS 页缓存部分冗余，优化的真实价值在受限内存。</w:t>
+        <w:t xml:space="preserve">满内存下应用缓存与 OS 页缓存部分冗余，优化价值在受限内存。</w:t>
       </w:r>
     </w:p>
     <w:p>
@@ -4219,7 +6086,7 @@
           <w:sz w:val="21"/>
           <w:szCs w:val="21"/>
         </w:rPr>
-        <w:t xml:space="preserve">受限内存对比因 OOM 仅取得学习策略一组完整数据 + 原生崩溃的定性结论；原生模式在该配置下无法稳定完成。</w:t>
+        <w:t xml:space="preserve">eval_disk 中 cache_size_mb=0 实为"无淘汰上限=无限缓存"而非"无缓存"；baseline1/2 因此实际缓存了全部节点。</w:t>
       </w:r>
     </w:p>
     <w:p>
@@ -4237,7 +6104,7 @@
           <w:sz w:val="21"/>
           <w:szCs w:val="21"/>
         </w:rPr>
-        <w:t xml:space="preserve">eval_disk 始终整库载入 base（约 1GB）成为受限内存实验的固定开销下限。</w:t>
+        <w:t xml:space="preserve">4KB-vs-2KB 未能同二进制严格对照(瘦身二进制读不了旧 4KB 索引)；结论靠"SIFT 精确减半+召回不变"与"2KB 9ms 无 OOM vs 4KB 81ms+OOM"支撑。</w:t>
       </w:r>
     </w:p>
     <w:p>
@@ -4255,46 +6122,7 @@
           <w:sz w:val="21"/>
           <w:szCs w:val="21"/>
         </w:rPr>
-        <w:t xml:space="preserve">单元测试 compaction_merge_test（写路径的 total_nodes 检查）当前失败，与本轮缓存/SIMD 改动正交，待单独排查。</w:t>
-      </w:r>
-    </w:p>
-    <w:p>
-      <w:pPr>
-        <w:pStyle w:val="Heading1"/>
-      </w:pPr>
-      <w:r>
-        <w:rPr>
-          <w:rFonts w:ascii="Microsoft YaHei" w:cs="Microsoft YaHei" w:eastAsia="Microsoft YaHei" w:hAnsi="Microsoft YaHei"/>
-        </w:rPr>
-        <w:t xml:space="preserve">7  结论与后续优先级</w:t>
-      </w:r>
-    </w:p>
-    <w:p>
-      <w:pPr>
-        <w:spacing w:after="120" w:line="276"/>
-      </w:pPr>
-      <w:r>
-        <w:rPr>
-          <w:rFonts w:ascii="Microsoft YaHei" w:cs="Microsoft YaHei" w:eastAsia="Microsoft YaHei" w:hAnsi="Microsoft YaHei"/>
-          <w:sz w:val="21"/>
-          <w:szCs w:val="21"/>
-        </w:rPr>
-        <w:t xml:space="preserve">砍半磁盘读数与静态 pin 枢纽是实打实的 I/O 优势，但只有在“数据 &gt; 内存、真读盘”时才转化为性能与稳定性收益——那时 Linux 原生模式直接 OOM 崩溃，而本引擎的学习策略靠准入控制活下来并稳定服务（recall 0.994）。满内存下 OS 页缓存已足够好，应用缓存是净开销。</w:t>
-      </w:r>
-    </w:p>
-    <w:p>
-      <w:pPr>
-        <w:spacing w:after="120" w:line="276"/>
-      </w:pPr>
-      <w:r>
-        <w:rPr>
-          <w:rFonts w:ascii="Microsoft YaHei" w:cs="Microsoft YaHei" w:eastAsia="Microsoft YaHei" w:hAnsi="Microsoft YaHei"/>
-          <w:b/>
-          <w:bCs/>
-          <w:sz w:val="21"/>
-          <w:szCs w:val="21"/>
-        </w:rPr>
-        <w:t xml:space="preserve">后续优先级：</w:t>
+        <w:t xml:space="preserve">ISVM 为固定权重整数线性式(非训练)；RemapCom/NobLSM/NVTable 为进程内模拟；均属工程简化，应如实定位。</w:t>
       </w:r>
     </w:p>
     <w:p>
@@ -4312,7 +6140,46 @@
           <w:sz w:val="21"/>
           <w:szCs w:val="21"/>
         </w:rPr>
-        <w:t xml:space="preserve">P0：升级 liburing 使 io_uring 真正生效，量化异步预取的尾延迟收益（当前最大未验证卖点）。</w:t>
+        <w:t xml:space="preserve">compaction_merge_test(写路径 total_nodes 检查)当前失败，与本轮缓存/SIMD/瘦身改动正交，待单独排查。</w:t>
+      </w:r>
+    </w:p>
+    <w:p>
+      <w:pPr>
+        <w:pStyle w:val="Heading1"/>
+      </w:pPr>
+      <w:r>
+        <w:rPr>
+          <w:rFonts w:ascii="Microsoft YaHei" w:cs="Microsoft YaHei" w:eastAsia="Microsoft YaHei" w:hAnsi="Microsoft YaHei"/>
+        </w:rPr>
+        <w:t xml:space="preserve">7  结论与后续优先级</w:t>
+      </w:r>
+    </w:p>
+    <w:p>
+      <w:pPr>
+        <w:spacing w:after="120" w:line="276"/>
+      </w:pPr>
+      <w:r>
+        <w:rPr>
+          <w:rFonts w:ascii="Microsoft YaHei" w:cs="Microsoft YaHei" w:eastAsia="Microsoft YaHei" w:hAnsi="Microsoft YaHei"/>
+          <w:sz w:val="21"/>
+          <w:szCs w:val="21"/>
+        </w:rPr>
+        <w:t xml:space="preserve">在"数据&gt;内存"的真实磁盘受限场景，本引擎相对 Linux 原生 I/O 的优势是确凿的：磁盘块读砍半、靠静态 pin+准入避免 OOM；NodeBlock 瘦身把索引减半，使原本 OOM 的负载降到 9ms 级稳定服务。满内存下 OS 页缓存已足够，应用缓存为净开销。</w:t>
+      </w:r>
+    </w:p>
+    <w:p>
+      <w:pPr>
+        <w:spacing w:after="120" w:line="276"/>
+      </w:pPr>
+      <w:r>
+        <w:rPr>
+          <w:rFonts w:ascii="Microsoft YaHei" w:cs="Microsoft YaHei" w:eastAsia="Microsoft YaHei" w:hAnsi="Microsoft YaHei"/>
+          <w:b/>
+          <w:bCs/>
+          <w:sz w:val="21"/>
+          <w:szCs w:val="21"/>
+        </w:rPr>
+        <w:t xml:space="preserve">后续优先级：</w:t>
       </w:r>
     </w:p>
     <w:p>
@@ -4330,7 +6197,7 @@
           <w:sz w:val="21"/>
           <w:szCs w:val="21"/>
         </w:rPr>
-        <w:t xml:space="preserve">P1：PQ/SQ 量化——压缩码驻留内存，使“数据 &gt; 内存”评测成立并减少高维距离量（对 GIST 960维 收益最大）。</w:t>
+        <w:t xml:space="preserve">P0：升级 liburing 使 io_uring 生效，量化异步预取尾延迟收益(当前最大未验证卖点)。</w:t>
       </w:r>
     </w:p>
     <w:p>
@@ -4348,7 +6215,7 @@
           <w:sz w:val="21"/>
           <w:szCs w:val="21"/>
         </w:rPr>
-        <w:t xml:space="preserve">P1：消除写链路框架的空转开销（约 90ms/query）。</w:t>
+        <w:t xml:space="preserve">P1：PQ/SQ 量化——压缩码驻留内存，进一步降低高维距离量与内存占用(对 GIST 960维最有利)。</w:t>
       </w:r>
     </w:p>
     <w:p>
@@ -4366,7 +6233,7 @@
           <w:sz w:val="21"/>
           <w:szCs w:val="21"/>
         </w:rPr>
-        <w:t xml:space="preserve">P2：排查并修复 compaction_merge_test；NodeBlock 瘦身（去除可由 node_id 推算的 neighbor_offsets，块减半、缓存翻倍）。</w:t>
+        <w:t xml:space="preserve">P2：排查修复 compaction_merge_test；图重排接进 build/compaction(当前仅离线工具)。</w:t>
       </w:r>
     </w:p>
     <w:sectPr>
@@ -4433,7 +6300,7 @@
         <w:sz w:val="16"/>
         <w:szCs w:val="16"/>
       </w:rPr>
-      <w:t xml:space="preserve">ai-agent-memory  I/O 优化实验报告  ·  第 </w:t>
+      <w:t xml:space="preserve">ai-agent-memory  I/O 优化实验报告 v2  ·  第 </w:t>
     </w:r>
     <w:r>
       <w:rPr>

</xml_diff>